<commit_message>
jenis permohonan , word permohonan
</commit_message>
<xml_diff>
--- a/application/third_party/PhpWord/permohonan.docx
+++ b/application/third_party/PhpWord/permohonan.docx
@@ -1,6 +1,6 @@
 
 <file path=word/document.xml><?xml version="1.0" encoding="utf-8"?>
-<w:document xmlns:wpc="http://schemas.microsoft.com/office/word/2010/wordprocessingCanvas" xmlns:mc="http://schemas.openxmlformats.org/markup-compatibility/2006" xmlns:o="urn:schemas-microsoft-com:office:office" xmlns:r="http://schemas.openxmlformats.org/officeDocument/2006/relationships" xmlns:m="http://schemas.openxmlformats.org/officeDocument/2006/math" xmlns:v="urn:schemas-microsoft-com:vml" xmlns:wp14="http://schemas.microsoft.com/office/word/2010/wordprocessingDrawing" xmlns:wp="http://schemas.openxmlformats.org/drawingml/2006/wordprocessingDrawing" xmlns:w10="urn:schemas-microsoft-com:office:word" xmlns:w="http://schemas.openxmlformats.org/wordprocessingml/2006/main" xmlns:w14="http://schemas.microsoft.com/office/word/2010/wordml" xmlns:wpg="http://schemas.microsoft.com/office/word/2010/wordprocessingGroup" xmlns:wpi="http://schemas.microsoft.com/office/word/2010/wordprocessingInk" xmlns:wne="http://schemas.microsoft.com/office/word/2006/wordml" xmlns:wps="http://schemas.microsoft.com/office/word/2010/wordprocessingShape" mc:Ignorable="w14 wp14">
+<w:document xmlns:wpc="http://schemas.microsoft.com/office/word/2010/wordprocessingCanvas" xmlns:cx="http://schemas.microsoft.com/office/drawing/2014/chartex" xmlns:cx1="http://schemas.microsoft.com/office/drawing/2015/9/8/chartex" xmlns:cx2="http://schemas.microsoft.com/office/drawing/2015/10/21/chartex" xmlns:cx3="http://schemas.microsoft.com/office/drawing/2016/5/9/chartex" xmlns:cx4="http://schemas.microsoft.com/office/drawing/2016/5/10/chartex" xmlns:cx5="http://schemas.microsoft.com/office/drawing/2016/5/11/chartex" xmlns:cx6="http://schemas.microsoft.com/office/drawing/2016/5/12/chartex" xmlns:cx7="http://schemas.microsoft.com/office/drawing/2016/5/13/chartex" xmlns:cx8="http://schemas.microsoft.com/office/drawing/2016/5/14/chartex" xmlns:mc="http://schemas.openxmlformats.org/markup-compatibility/2006" xmlns:aink="http://schemas.microsoft.com/office/drawing/2016/ink" xmlns:am3d="http://schemas.microsoft.com/office/drawing/2017/model3d" xmlns:o="urn:schemas-microsoft-com:office:office" xmlns:oel="http://schemas.microsoft.com/office/2019/extlst" xmlns:r="http://schemas.openxmlformats.org/officeDocument/2006/relationships" xmlns:m="http://schemas.openxmlformats.org/officeDocument/2006/math" xmlns:v="urn:schemas-microsoft-com:vml" xmlns:wp14="http://schemas.microsoft.com/office/word/2010/wordprocessingDrawing" xmlns:wp="http://schemas.openxmlformats.org/drawingml/2006/wordprocessingDrawing" xmlns:w10="urn:schemas-microsoft-com:office:word" xmlns:w="http://schemas.openxmlformats.org/wordprocessingml/2006/main" xmlns:w14="http://schemas.microsoft.com/office/word/2010/wordml" xmlns:w15="http://schemas.microsoft.com/office/word/2012/wordml" xmlns:w16cex="http://schemas.microsoft.com/office/word/2018/wordml/cex" xmlns:w16cid="http://schemas.microsoft.com/office/word/2016/wordml/cid" xmlns:w16="http://schemas.microsoft.com/office/word/2018/wordml" xmlns:w16du="http://schemas.microsoft.com/office/word/2023/wordml/word16du" xmlns:w16sdtdh="http://schemas.microsoft.com/office/word/2020/wordml/sdtdatahash" xmlns:w16sdtfl="http://schemas.microsoft.com/office/word/2024/wordml/sdtformatlock" xmlns:w16se="http://schemas.microsoft.com/office/word/2015/wordml/symex" xmlns:wpg="http://schemas.microsoft.com/office/word/2010/wordprocessingGroup" xmlns:wpi="http://schemas.microsoft.com/office/word/2010/wordprocessingInk" xmlns:wne="http://schemas.microsoft.com/office/word/2006/wordml" xmlns:wps="http://schemas.microsoft.com/office/word/2010/wordprocessingShape" mc:Ignorable="w14 w15 w16se w16cid w16 w16cex w16sdtdh w16sdtfl w16du wp14">
   <w:body>
     <w:p>
       <w:pPr>
@@ -125,7 +125,7 @@
           <w:szCs w:val="24"/>
         </w:rPr>
         <w:drawing>
-          <wp:anchor distT="0" distB="0" distL="114300" distR="114300" simplePos="0" relativeHeight="251657216" behindDoc="1" locked="0" layoutInCell="0" allowOverlap="1">
+          <wp:anchor distT="0" distB="0" distL="114300" distR="114300" simplePos="0" relativeHeight="251657216" behindDoc="1" locked="0" layoutInCell="0" allowOverlap="1" wp14:anchorId="5629FAEB" wp14:editId="238BF8CB">
             <wp:simplePos x="0" y="0"/>
             <wp:positionH relativeFrom="column">
               <wp:posOffset>321945</wp:posOffset>
@@ -150,9 +150,7 @@
                     </pic:cNvPicPr>
                   </pic:nvPicPr>
                   <pic:blipFill>
-                    <a:blip r:embed="rId5">
-                      <a:extLst/>
-                    </a:blip>
+                    <a:blip r:embed="rId4"/>
                     <a:srcRect/>
                     <a:stretch>
                       <a:fillRect/>
@@ -183,7 +181,7 @@
         <mc:AlternateContent>
           <mc:Choice Requires="wps">
             <w:drawing>
-              <wp:anchor distT="0" distB="0" distL="114300" distR="114300" simplePos="0" relativeHeight="251658240" behindDoc="1" locked="0" layoutInCell="0" allowOverlap="1">
+              <wp:anchor distT="0" distB="0" distL="114300" distR="114300" simplePos="0" relativeHeight="251658240" behindDoc="1" locked="0" layoutInCell="0" allowOverlap="1" wp14:anchorId="4BD43B0B" wp14:editId="27E9F0C9">
                 <wp:simplePos x="0" y="0"/>
                 <wp:positionH relativeFrom="column">
                   <wp:posOffset>321310</wp:posOffset>
@@ -233,7 +231,10 @@
           </mc:Choice>
           <mc:Fallback>
             <w:pict>
-              <v:line id="Shape 2" o:spid="_x0000_s1027" style="position:absolute;z-index:251657728;visibility:visible;mso-wrap-style:square;mso-wrap-distance-left:0pt;mso-wrap-distance-top:0;mso-wrap-distance-right:0pt;mso-wrap-distance-bottom:0;mso-position-horizontal:absolute;mso-position-horizontal-relative:text;mso-position-vertical:absolute;mso-position-vertical-relative:text;" from="25.3pt,12.55pt" to="960.75pt,12.55pt" o:allowincell="f" strokecolor="#000000" strokeweight="0.2835pt"/>
+              <v:line w14:anchorId="7D3AEE62" id="Shape 2" o:spid="_x0000_s1026" style="position:absolute;z-index:-251658240;visibility:visible;mso-wrap-style:square;mso-wrap-distance-left:9pt;mso-wrap-distance-top:0;mso-wrap-distance-right:9pt;mso-wrap-distance-bottom:0;mso-position-horizontal:absolute;mso-position-horizontal-relative:text;mso-position-vertical:absolute;mso-position-vertical-relative:text" from="25.3pt,12.55pt" to="960.75pt,12.55pt" o:gfxdata="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" o:allowincell="f" filled="t" strokeweight=".1mm">
+                <v:stroke joinstyle="miter"/>
+                <o:lock v:ext="edit" shapetype="f"/>
+              </v:line>
             </w:pict>
           </mc:Fallback>
         </mc:AlternateContent>
@@ -369,8 +370,72 @@
                 <w:sz w:val="20"/>
                 <w:szCs w:val="20"/>
               </w:rPr>
-              <w:t>Saya yang bertanda tangan di bawah ini</w:t>
-            </w:r>
+              <w:t xml:space="preserve">Saya yang </w:t>
+            </w:r>
+            <w:proofErr w:type="spellStart"/>
+            <w:r>
+              <w:rPr>
+                <w:rFonts w:ascii="Tahoma" w:eastAsia="Tahoma" w:hAnsi="Tahoma" w:cs="Tahoma"/>
+                <w:sz w:val="20"/>
+                <w:szCs w:val="20"/>
+              </w:rPr>
+              <w:t>bertanda</w:t>
+            </w:r>
+            <w:proofErr w:type="spellEnd"/>
+            <w:r>
+              <w:rPr>
+                <w:rFonts w:ascii="Tahoma" w:eastAsia="Tahoma" w:hAnsi="Tahoma" w:cs="Tahoma"/>
+                <w:sz w:val="20"/>
+                <w:szCs w:val="20"/>
+              </w:rPr>
+              <w:t xml:space="preserve"> </w:t>
+            </w:r>
+            <w:proofErr w:type="spellStart"/>
+            <w:r>
+              <w:rPr>
+                <w:rFonts w:ascii="Tahoma" w:eastAsia="Tahoma" w:hAnsi="Tahoma" w:cs="Tahoma"/>
+                <w:sz w:val="20"/>
+                <w:szCs w:val="20"/>
+              </w:rPr>
+              <w:t>tangan</w:t>
+            </w:r>
+            <w:proofErr w:type="spellEnd"/>
+            <w:r>
+              <w:rPr>
+                <w:rFonts w:ascii="Tahoma" w:eastAsia="Tahoma" w:hAnsi="Tahoma" w:cs="Tahoma"/>
+                <w:sz w:val="20"/>
+                <w:szCs w:val="20"/>
+              </w:rPr>
+              <w:t xml:space="preserve"> di </w:t>
+            </w:r>
+            <w:proofErr w:type="spellStart"/>
+            <w:r>
+              <w:rPr>
+                <w:rFonts w:ascii="Tahoma" w:eastAsia="Tahoma" w:hAnsi="Tahoma" w:cs="Tahoma"/>
+                <w:sz w:val="20"/>
+                <w:szCs w:val="20"/>
+              </w:rPr>
+              <w:t>bawah</w:t>
+            </w:r>
+            <w:proofErr w:type="spellEnd"/>
+            <w:r>
+              <w:rPr>
+                <w:rFonts w:ascii="Tahoma" w:eastAsia="Tahoma" w:hAnsi="Tahoma" w:cs="Tahoma"/>
+                <w:sz w:val="20"/>
+                <w:szCs w:val="20"/>
+              </w:rPr>
+              <w:t xml:space="preserve"> </w:t>
+            </w:r>
+            <w:proofErr w:type="spellStart"/>
+            <w:r>
+              <w:rPr>
+                <w:rFonts w:ascii="Tahoma" w:eastAsia="Tahoma" w:hAnsi="Tahoma" w:cs="Tahoma"/>
+                <w:sz w:val="20"/>
+                <w:szCs w:val="20"/>
+              </w:rPr>
+              <w:t>ini</w:t>
+            </w:r>
+            <w:proofErr w:type="spellEnd"/>
           </w:p>
         </w:tc>
         <w:tc>
@@ -611,7 +676,6 @@
                 <w:szCs w:val="20"/>
               </w:rPr>
             </w:pPr>
-            <w:proofErr w:type="spellStart"/>
             <w:r>
               <w:rPr>
                 <w:rFonts w:ascii="Tahoma" w:eastAsia="Tahoma" w:hAnsi="Tahoma" w:cs="Tahoma"/>
@@ -620,7 +684,6 @@
               </w:rPr>
               <w:t>Alamat</w:t>
             </w:r>
-            <w:proofErr w:type="spellEnd"/>
           </w:p>
         </w:tc>
         <w:tc>
@@ -673,8 +736,6 @@
             </w:r>
           </w:p>
         </w:tc>
-        <w:bookmarkStart w:id="1" w:name="_GoBack"/>
-        <w:bookmarkEnd w:id="1"/>
       </w:tr>
       <w:tr>
         <w:trPr>
@@ -693,13 +754,23 @@
                 <w:szCs w:val="20"/>
               </w:rPr>
             </w:pPr>
-            <w:r>
-              <w:rPr>
-                <w:rFonts w:ascii="Tahoma" w:eastAsia="Tahoma" w:hAnsi="Tahoma" w:cs="Tahoma"/>
-                <w:sz w:val="20"/>
-                <w:szCs w:val="20"/>
-              </w:rPr>
-              <w:t>Telepon / Fax</w:t>
+            <w:proofErr w:type="spellStart"/>
+            <w:r>
+              <w:rPr>
+                <w:rFonts w:ascii="Tahoma" w:eastAsia="Tahoma" w:hAnsi="Tahoma" w:cs="Tahoma"/>
+                <w:sz w:val="20"/>
+                <w:szCs w:val="20"/>
+              </w:rPr>
+              <w:t>Telepon</w:t>
+            </w:r>
+            <w:proofErr w:type="spellEnd"/>
+            <w:r>
+              <w:rPr>
+                <w:rFonts w:ascii="Tahoma" w:eastAsia="Tahoma" w:hAnsi="Tahoma" w:cs="Tahoma"/>
+                <w:sz w:val="20"/>
+                <w:szCs w:val="20"/>
+              </w:rPr>
+              <w:t xml:space="preserve"> / Fax</w:t>
             </w:r>
           </w:p>
         </w:tc>
@@ -977,6 +1048,126 @@
           </w:p>
         </w:tc>
       </w:tr>
+      <w:tr>
+        <w:trPr>
+          <w:trHeight w:val="250"/>
+        </w:trPr>
+        <w:tc>
+          <w:tcPr>
+            <w:tcW w:w="3620" w:type="dxa"/>
+            <w:vAlign w:val="bottom"/>
+          </w:tcPr>
+          <w:p>
+            <w:pPr>
+              <w:ind w:left="60"/>
+              <w:rPr>
+                <w:rFonts w:ascii="Tahoma" w:eastAsia="Tahoma" w:hAnsi="Tahoma" w:cs="Tahoma"/>
+                <w:sz w:val="20"/>
+                <w:szCs w:val="20"/>
+              </w:rPr>
+            </w:pPr>
+            <w:r>
+              <w:rPr>
+                <w:rFonts w:ascii="Tahoma" w:eastAsia="Tahoma" w:hAnsi="Tahoma" w:cs="Tahoma"/>
+                <w:sz w:val="20"/>
+                <w:szCs w:val="20"/>
+              </w:rPr>
+              <w:t xml:space="preserve">Jenis </w:t>
+            </w:r>
+            <w:proofErr w:type="spellStart"/>
+            <w:r>
+              <w:rPr>
+                <w:rFonts w:ascii="Tahoma" w:eastAsia="Tahoma" w:hAnsi="Tahoma" w:cs="Tahoma"/>
+                <w:sz w:val="20"/>
+                <w:szCs w:val="20"/>
+              </w:rPr>
+              <w:t>Pengantaran</w:t>
+            </w:r>
+            <w:proofErr w:type="spellEnd"/>
+          </w:p>
+        </w:tc>
+        <w:tc>
+          <w:tcPr>
+            <w:tcW w:w="220" w:type="dxa"/>
+            <w:vAlign w:val="bottom"/>
+          </w:tcPr>
+          <w:p>
+            <w:pPr>
+              <w:ind w:left="40"/>
+              <w:rPr>
+                <w:rFonts w:ascii="Tahoma" w:eastAsia="Tahoma" w:hAnsi="Tahoma" w:cs="Tahoma"/>
+                <w:sz w:val="20"/>
+                <w:szCs w:val="20"/>
+              </w:rPr>
+            </w:pPr>
+            <w:r>
+              <w:rPr>
+                <w:rFonts w:ascii="Tahoma" w:eastAsia="Tahoma" w:hAnsi="Tahoma" w:cs="Tahoma"/>
+                <w:sz w:val="20"/>
+                <w:szCs w:val="20"/>
+              </w:rPr>
+              <w:t>:</w:t>
+            </w:r>
+          </w:p>
+        </w:tc>
+        <w:tc>
+          <w:tcPr>
+            <w:tcW w:w="2540" w:type="dxa"/>
+            <w:vAlign w:val="bottom"/>
+          </w:tcPr>
+          <w:p>
+            <w:pPr>
+              <w:rPr>
+                <w:rFonts w:ascii="Tahoma" w:eastAsia="Tahoma" w:hAnsi="Tahoma" w:cs="Tahoma"/>
+                <w:sz w:val="20"/>
+                <w:szCs w:val="20"/>
+              </w:rPr>
+            </w:pPr>
+            <w:r>
+              <w:rPr>
+                <w:rFonts w:ascii="Tahoma" w:eastAsia="Tahoma" w:hAnsi="Tahoma" w:cs="Tahoma"/>
+                <w:sz w:val="20"/>
+                <w:szCs w:val="20"/>
+              </w:rPr>
+              <w:t>${</w:t>
+            </w:r>
+            <w:proofErr w:type="spellStart"/>
+            <w:r>
+              <w:rPr>
+                <w:rFonts w:ascii="Tahoma" w:eastAsia="Tahoma" w:hAnsi="Tahoma" w:cs="Tahoma"/>
+                <w:sz w:val="20"/>
+                <w:szCs w:val="20"/>
+              </w:rPr>
+              <w:t>body_jenis_penga</w:t>
+            </w:r>
+            <w:r>
+              <w:rPr>
+                <w:rFonts w:ascii="Tahoma" w:eastAsia="Tahoma" w:hAnsi="Tahoma" w:cs="Tahoma"/>
+                <w:sz w:val="20"/>
+                <w:szCs w:val="20"/>
+              </w:rPr>
+              <w:t>n</w:t>
+            </w:r>
+            <w:r>
+              <w:rPr>
+                <w:rFonts w:ascii="Tahoma" w:eastAsia="Tahoma" w:hAnsi="Tahoma" w:cs="Tahoma"/>
+                <w:sz w:val="20"/>
+                <w:szCs w:val="20"/>
+              </w:rPr>
+              <w:t>taran</w:t>
+            </w:r>
+            <w:proofErr w:type="spellEnd"/>
+            <w:r>
+              <w:rPr>
+                <w:rFonts w:ascii="Tahoma" w:eastAsia="Tahoma" w:hAnsi="Tahoma" w:cs="Tahoma"/>
+                <w:sz w:val="20"/>
+                <w:szCs w:val="20"/>
+              </w:rPr>
+              <w:t>}</w:t>
+            </w:r>
+          </w:p>
+        </w:tc>
+      </w:tr>
     </w:tbl>
     <w:p>
       <w:pPr>
@@ -1001,7 +1192,115 @@
           <w:sz w:val="20"/>
           <w:szCs w:val="20"/>
         </w:rPr>
-        <w:t>Bersama ini mengajukan permohonan pengujian seagai berikut :</w:t>
+        <w:t xml:space="preserve">Bersama </w:t>
+      </w:r>
+      <w:proofErr w:type="spellStart"/>
+      <w:r>
+        <w:rPr>
+          <w:rFonts w:ascii="Tahoma" w:eastAsia="Tahoma" w:hAnsi="Tahoma" w:cs="Tahoma"/>
+          <w:sz w:val="20"/>
+          <w:szCs w:val="20"/>
+        </w:rPr>
+        <w:t>ini</w:t>
+      </w:r>
+      <w:proofErr w:type="spellEnd"/>
+      <w:r>
+        <w:rPr>
+          <w:rFonts w:ascii="Tahoma" w:eastAsia="Tahoma" w:hAnsi="Tahoma" w:cs="Tahoma"/>
+          <w:sz w:val="20"/>
+          <w:szCs w:val="20"/>
+        </w:rPr>
+        <w:t xml:space="preserve"> </w:t>
+      </w:r>
+      <w:proofErr w:type="spellStart"/>
+      <w:r>
+        <w:rPr>
+          <w:rFonts w:ascii="Tahoma" w:eastAsia="Tahoma" w:hAnsi="Tahoma" w:cs="Tahoma"/>
+          <w:sz w:val="20"/>
+          <w:szCs w:val="20"/>
+        </w:rPr>
+        <w:t>mengajukan</w:t>
+      </w:r>
+      <w:proofErr w:type="spellEnd"/>
+      <w:r>
+        <w:rPr>
+          <w:rFonts w:ascii="Tahoma" w:eastAsia="Tahoma" w:hAnsi="Tahoma" w:cs="Tahoma"/>
+          <w:sz w:val="20"/>
+          <w:szCs w:val="20"/>
+        </w:rPr>
+        <w:t xml:space="preserve"> </w:t>
+      </w:r>
+      <w:proofErr w:type="spellStart"/>
+      <w:r>
+        <w:rPr>
+          <w:rFonts w:ascii="Tahoma" w:eastAsia="Tahoma" w:hAnsi="Tahoma" w:cs="Tahoma"/>
+          <w:sz w:val="20"/>
+          <w:szCs w:val="20"/>
+        </w:rPr>
+        <w:t>permohonan</w:t>
+      </w:r>
+      <w:proofErr w:type="spellEnd"/>
+      <w:r>
+        <w:rPr>
+          <w:rFonts w:ascii="Tahoma" w:eastAsia="Tahoma" w:hAnsi="Tahoma" w:cs="Tahoma"/>
+          <w:sz w:val="20"/>
+          <w:szCs w:val="20"/>
+        </w:rPr>
+        <w:t xml:space="preserve"> </w:t>
+      </w:r>
+      <w:proofErr w:type="spellStart"/>
+      <w:r>
+        <w:rPr>
+          <w:rFonts w:ascii="Tahoma" w:eastAsia="Tahoma" w:hAnsi="Tahoma" w:cs="Tahoma"/>
+          <w:sz w:val="20"/>
+          <w:szCs w:val="20"/>
+        </w:rPr>
+        <w:t>pengujian</w:t>
+      </w:r>
+      <w:proofErr w:type="spellEnd"/>
+      <w:r>
+        <w:rPr>
+          <w:rFonts w:ascii="Tahoma" w:eastAsia="Tahoma" w:hAnsi="Tahoma" w:cs="Tahoma"/>
+          <w:sz w:val="20"/>
+          <w:szCs w:val="20"/>
+        </w:rPr>
+        <w:t xml:space="preserve"> </w:t>
+      </w:r>
+      <w:proofErr w:type="spellStart"/>
+      <w:r>
+        <w:rPr>
+          <w:rFonts w:ascii="Tahoma" w:eastAsia="Tahoma" w:hAnsi="Tahoma" w:cs="Tahoma"/>
+          <w:sz w:val="20"/>
+          <w:szCs w:val="20"/>
+        </w:rPr>
+        <w:t>seagai</w:t>
+      </w:r>
+      <w:proofErr w:type="spellEnd"/>
+      <w:r>
+        <w:rPr>
+          <w:rFonts w:ascii="Tahoma" w:eastAsia="Tahoma" w:hAnsi="Tahoma" w:cs="Tahoma"/>
+          <w:sz w:val="20"/>
+          <w:szCs w:val="20"/>
+        </w:rPr>
+        <w:t xml:space="preserve"> </w:t>
+      </w:r>
+      <w:proofErr w:type="spellStart"/>
+      <w:r>
+        <w:rPr>
+          <w:rFonts w:ascii="Tahoma" w:eastAsia="Tahoma" w:hAnsi="Tahoma" w:cs="Tahoma"/>
+          <w:sz w:val="20"/>
+          <w:szCs w:val="20"/>
+        </w:rPr>
+        <w:t>berikut</w:t>
+      </w:r>
+      <w:proofErr w:type="spellEnd"/>
+      <w:r>
+        <w:rPr>
+          <w:rFonts w:ascii="Tahoma" w:eastAsia="Tahoma" w:hAnsi="Tahoma" w:cs="Tahoma"/>
+          <w:sz w:val="20"/>
+          <w:szCs w:val="20"/>
+        </w:rPr>
+        <w:t xml:space="preserve"> :</w:t>
       </w:r>
     </w:p>
     <w:p>
@@ -1084,6 +1383,7 @@
                 <w:szCs w:val="20"/>
               </w:rPr>
             </w:pPr>
+            <w:proofErr w:type="spellStart"/>
             <w:r>
               <w:rPr>
                 <w:rFonts w:ascii="Tahoma" w:eastAsia="Tahoma" w:hAnsi="Tahoma" w:cs="Tahoma"/>
@@ -1092,6 +1392,7 @@
               </w:rPr>
               <w:t>Komoditas</w:t>
             </w:r>
+            <w:proofErr w:type="spellEnd"/>
           </w:p>
         </w:tc>
         <w:tc>
@@ -1117,8 +1418,18 @@
                 <w:sz w:val="20"/>
                 <w:szCs w:val="20"/>
               </w:rPr>
-              <w:t>Jenis / Varietas</w:t>
-            </w:r>
+              <w:t xml:space="preserve">Jenis / </w:t>
+            </w:r>
+            <w:proofErr w:type="spellStart"/>
+            <w:r>
+              <w:rPr>
+                <w:rFonts w:ascii="Tahoma" w:eastAsia="Tahoma" w:hAnsi="Tahoma" w:cs="Tahoma"/>
+                <w:sz w:val="20"/>
+                <w:szCs w:val="20"/>
+              </w:rPr>
+              <w:t>Varietas</w:t>
+            </w:r>
+            <w:proofErr w:type="spellEnd"/>
           </w:p>
         </w:tc>
         <w:tc>
@@ -1138,6 +1449,7 @@
                 <w:szCs w:val="20"/>
               </w:rPr>
             </w:pPr>
+            <w:proofErr w:type="spellStart"/>
             <w:r>
               <w:rPr>
                 <w:rFonts w:ascii="Tahoma" w:eastAsia="Tahoma" w:hAnsi="Tahoma" w:cs="Tahoma"/>
@@ -1146,6 +1458,7 @@
               </w:rPr>
               <w:t>Jumlah</w:t>
             </w:r>
+            <w:proofErr w:type="spellEnd"/>
           </w:p>
         </w:tc>
         <w:tc>
@@ -1165,6 +1478,7 @@
                 <w:szCs w:val="20"/>
               </w:rPr>
             </w:pPr>
+            <w:proofErr w:type="spellStart"/>
             <w:r>
               <w:rPr>
                 <w:rFonts w:ascii="Tahoma" w:eastAsia="Tahoma" w:hAnsi="Tahoma" w:cs="Tahoma"/>
@@ -1173,6 +1487,7 @@
               </w:rPr>
               <w:t>Kemasan</w:t>
             </w:r>
+            <w:proofErr w:type="spellEnd"/>
           </w:p>
         </w:tc>
         <w:tc>
@@ -1192,6 +1507,7 @@
                 <w:szCs w:val="20"/>
               </w:rPr>
             </w:pPr>
+            <w:proofErr w:type="spellStart"/>
             <w:r>
               <w:rPr>
                 <w:rFonts w:ascii="Tahoma" w:eastAsia="Tahoma" w:hAnsi="Tahoma" w:cs="Tahoma"/>
@@ -1200,6 +1516,7 @@
               </w:rPr>
               <w:t>Kondisi</w:t>
             </w:r>
+            <w:proofErr w:type="spellEnd"/>
           </w:p>
         </w:tc>
         <w:tc>
@@ -1225,8 +1542,18 @@
                 <w:sz w:val="20"/>
                 <w:szCs w:val="20"/>
               </w:rPr>
-              <w:t>Parameter Pengujian</w:t>
-            </w:r>
+              <w:t xml:space="preserve">Parameter </w:t>
+            </w:r>
+            <w:proofErr w:type="spellStart"/>
+            <w:r>
+              <w:rPr>
+                <w:rFonts w:ascii="Tahoma" w:eastAsia="Tahoma" w:hAnsi="Tahoma" w:cs="Tahoma"/>
+                <w:sz w:val="20"/>
+                <w:szCs w:val="20"/>
+              </w:rPr>
+              <w:t>Pengujian</w:t>
+            </w:r>
+            <w:proofErr w:type="spellEnd"/>
           </w:p>
         </w:tc>
         <w:tc>
@@ -1273,6 +1600,7 @@
                 <w:szCs w:val="20"/>
               </w:rPr>
             </w:pPr>
+            <w:proofErr w:type="spellStart"/>
             <w:r>
               <w:rPr>
                 <w:rFonts w:ascii="Tahoma" w:eastAsia="Tahoma" w:hAnsi="Tahoma" w:cs="Tahoma"/>
@@ -1281,6 +1609,7 @@
               </w:rPr>
               <w:t>Keterangan</w:t>
             </w:r>
+            <w:proofErr w:type="spellEnd"/>
           </w:p>
         </w:tc>
       </w:tr>
@@ -1901,41 +2230,13 @@
                 <w:szCs w:val="20"/>
               </w:rPr>
             </w:pPr>
-            <w:proofErr w:type="spellStart"/>
-            <w:r>
-              <w:rPr>
-                <w:rFonts w:ascii="Tahoma" w:eastAsia="Tahoma" w:hAnsi="Tahoma" w:cs="Tahoma"/>
-                <w:sz w:val="20"/>
-                <w:szCs w:val="20"/>
-              </w:rPr>
-              <w:t>Hasil</w:t>
-            </w:r>
-            <w:proofErr w:type="spellEnd"/>
-            <w:r>
-              <w:rPr>
-                <w:rFonts w:ascii="Tahoma" w:eastAsia="Tahoma" w:hAnsi="Tahoma" w:cs="Tahoma"/>
-                <w:sz w:val="20"/>
-                <w:szCs w:val="20"/>
-              </w:rPr>
-              <w:t xml:space="preserve"> </w:t>
-            </w:r>
-            <w:proofErr w:type="spellStart"/>
-            <w:r>
-              <w:rPr>
-                <w:rFonts w:ascii="Tahoma" w:eastAsia="Tahoma" w:hAnsi="Tahoma" w:cs="Tahoma"/>
-                <w:sz w:val="20"/>
-                <w:szCs w:val="20"/>
-              </w:rPr>
-              <w:t>Kaji</w:t>
-            </w:r>
-            <w:proofErr w:type="spellEnd"/>
-            <w:r>
-              <w:rPr>
-                <w:rFonts w:ascii="Tahoma" w:eastAsia="Tahoma" w:hAnsi="Tahoma" w:cs="Tahoma"/>
-                <w:sz w:val="20"/>
-                <w:szCs w:val="20"/>
-              </w:rPr>
-              <w:t xml:space="preserve"> </w:t>
+            <w:r>
+              <w:rPr>
+                <w:rFonts w:ascii="Tahoma" w:eastAsia="Tahoma" w:hAnsi="Tahoma" w:cs="Tahoma"/>
+                <w:sz w:val="20"/>
+                <w:szCs w:val="20"/>
+              </w:rPr>
+              <w:t xml:space="preserve">Hasil Kaji </w:t>
             </w:r>
             <w:proofErr w:type="spellStart"/>
             <w:r>
@@ -2580,7 +2881,7 @@
           <w:szCs w:val="1"/>
         </w:rPr>
       </w:pPr>
-      <w:hyperlink r:id="rId6">
+      <w:hyperlink r:id="rId5">
         <w:r>
           <w:rPr>
             <w:rFonts w:ascii="Arial" w:eastAsia="Arial" w:hAnsi="Arial" w:cs="Arial"/>
@@ -2604,7 +2905,7 @@
 </file>
 
 <file path=word/styles.xml><?xml version="1.0" encoding="utf-8"?>
-<w:styles xmlns:mc="http://schemas.openxmlformats.org/markup-compatibility/2006" xmlns:r="http://schemas.openxmlformats.org/officeDocument/2006/relationships" xmlns:w="http://schemas.openxmlformats.org/wordprocessingml/2006/main" xmlns:w14="http://schemas.microsoft.com/office/word/2010/wordml" mc:Ignorable="w14">
+<w:styles xmlns:mc="http://schemas.openxmlformats.org/markup-compatibility/2006" xmlns:r="http://schemas.openxmlformats.org/officeDocument/2006/relationships" xmlns:w="http://schemas.openxmlformats.org/wordprocessingml/2006/main" xmlns:w14="http://schemas.microsoft.com/office/word/2010/wordml" xmlns:w15="http://schemas.microsoft.com/office/word/2012/wordml" xmlns:w16cex="http://schemas.microsoft.com/office/word/2018/wordml/cex" xmlns:w16cid="http://schemas.microsoft.com/office/word/2016/wordml/cid" xmlns:w16="http://schemas.microsoft.com/office/word/2018/wordml" xmlns:w16du="http://schemas.microsoft.com/office/word/2023/wordml/word16du" xmlns:w16sdtdh="http://schemas.microsoft.com/office/word/2020/wordml/sdtdatahash" xmlns:w16sdtfl="http://schemas.microsoft.com/office/word/2024/wordml/sdtformatlock" xmlns:w16se="http://schemas.microsoft.com/office/word/2015/wordml/symex" mc:Ignorable="w14 w15 w16se w16cid w16 w16cex w16sdtdh w16sdtfl w16du">
   <w:docDefaults>
     <w:rPrDefault>
       <w:rPr>
@@ -2616,330 +2917,383 @@
     </w:rPrDefault>
     <w:pPrDefault/>
   </w:docDefaults>
-  <w:latentStyles w:defLockedState="0" w:defUIPriority="99" w:defSemiHidden="1" w:defUnhideWhenUsed="1" w:defQFormat="0" w:count="267">
-    <w:lsdException w:name="Normal" w:semiHidden="0" w:uiPriority="0" w:unhideWhenUsed="0" w:qFormat="1"/>
-    <w:lsdException w:name="heading 1" w:semiHidden="0" w:uiPriority="9" w:unhideWhenUsed="0" w:qFormat="1"/>
-    <w:lsdException w:name="heading 2" w:uiPriority="9" w:qFormat="1"/>
-    <w:lsdException w:name="heading 3" w:uiPriority="9" w:qFormat="1"/>
-    <w:lsdException w:name="heading 4" w:uiPriority="9" w:qFormat="1"/>
-    <w:lsdException w:name="heading 5" w:uiPriority="9" w:qFormat="1"/>
-    <w:lsdException w:name="heading 6" w:uiPriority="9" w:qFormat="1"/>
-    <w:lsdException w:name="heading 7" w:uiPriority="9" w:qFormat="1"/>
-    <w:lsdException w:name="heading 8" w:uiPriority="9" w:qFormat="1"/>
-    <w:lsdException w:name="heading 9" w:uiPriority="9" w:qFormat="1"/>
-    <w:lsdException w:name="toc 1" w:uiPriority="39"/>
-    <w:lsdException w:name="toc 2" w:uiPriority="39"/>
-    <w:lsdException w:name="toc 3" w:uiPriority="39"/>
-    <w:lsdException w:name="toc 4" w:uiPriority="39"/>
-    <w:lsdException w:name="toc 5" w:uiPriority="39"/>
-    <w:lsdException w:name="toc 6" w:uiPriority="39"/>
-    <w:lsdException w:name="toc 7" w:uiPriority="39"/>
-    <w:lsdException w:name="toc 8" w:uiPriority="39"/>
-    <w:lsdException w:name="toc 9" w:uiPriority="39"/>
-    <w:lsdException w:name="caption" w:uiPriority="35" w:qFormat="1"/>
-    <w:lsdException w:name="Title" w:semiHidden="0" w:uiPriority="10" w:unhideWhenUsed="0" w:qFormat="1"/>
-    <w:lsdException w:name="Default Paragraph Font" w:uiPriority="1"/>
-    <w:lsdException w:name="Subtitle" w:semiHidden="0" w:uiPriority="11" w:unhideWhenUsed="0" w:qFormat="1"/>
-    <w:lsdException w:name="Strong" w:semiHidden="0" w:uiPriority="22" w:unhideWhenUsed="0" w:qFormat="1"/>
-    <w:lsdException w:name="Emphasis" w:semiHidden="0" w:uiPriority="20" w:unhideWhenUsed="0" w:qFormat="1"/>
-    <w:lsdException w:name="Table Grid" w:semiHidden="0" w:uiPriority="59" w:unhideWhenUsed="0"/>
-    <w:lsdException w:name="Placeholder Text" w:unhideWhenUsed="0"/>
-    <w:lsdException w:name="No Spacing" w:semiHidden="0" w:uiPriority="1" w:unhideWhenUsed="0" w:qFormat="1"/>
-    <w:lsdException w:name="Light Shading" w:semiHidden="0" w:uiPriority="60" w:unhideWhenUsed="0"/>
-    <w:lsdException w:name="Light List" w:semiHidden="0" w:uiPriority="61" w:unhideWhenUsed="0"/>
-    <w:lsdException w:name="Light Grid" w:semiHidden="0" w:uiPriority="62" w:unhideWhenUsed="0"/>
-    <w:lsdException w:name="Medium Shading 1" w:semiHidden="0" w:uiPriority="63" w:unhideWhenUsed="0"/>
-    <w:lsdException w:name="Medium Shading 2" w:semiHidden="0" w:uiPriority="64" w:unhideWhenUsed="0"/>
-    <w:lsdException w:name="Medium List 1" w:semiHidden="0" w:uiPriority="65" w:unhideWhenUsed="0"/>
-    <w:lsdException w:name="Medium List 2" w:semiHidden="0" w:uiPriority="66" w:unhideWhenUsed="0"/>
-    <w:lsdException w:name="Medium Grid 1" w:semiHidden="0" w:uiPriority="67" w:unhideWhenUsed="0"/>
-    <w:lsdException w:name="Medium Grid 2" w:semiHidden="0" w:uiPriority="68" w:unhideWhenUsed="0"/>
-    <w:lsdException w:name="Medium Grid 3" w:semiHidden="0" w:uiPriority="69" w:unhideWhenUsed="0"/>
-    <w:lsdException w:name="Dark List" w:semiHidden="0" w:uiPriority="70" w:unhideWhenUsed="0"/>
-    <w:lsdException w:name="Colorful Shading" w:semiHidden="0" w:uiPriority="71" w:unhideWhenUsed="0"/>
-    <w:lsdException w:name="Colorful List" w:semiHidden="0" w:uiPriority="72" w:unhideWhenUsed="0"/>
-    <w:lsdException w:name="Colorful Grid" w:semiHidden="0" w:uiPriority="73" w:unhideWhenUsed="0"/>
-    <w:lsdException w:name="Light Shading Accent 1" w:semiHidden="0" w:uiPriority="60" w:unhideWhenUsed="0"/>
-    <w:lsdException w:name="Light List Accent 1" w:semiHidden="0" w:uiPriority="61" w:unhideWhenUsed="0"/>
-    <w:lsdException w:name="Light Grid Accent 1" w:semiHidden="0" w:uiPriority="62" w:unhideWhenUsed="0"/>
-    <w:lsdException w:name="Medium Shading 1 Accent 1" w:semiHidden="0" w:uiPriority="63" w:unhideWhenUsed="0"/>
-    <w:lsdException w:name="Medium Shading 2 Accent 1" w:semiHidden="0" w:uiPriority="64" w:unhideWhenUsed="0"/>
-    <w:lsdException w:name="Medium List 1 Accent 1" w:semiHidden="0" w:uiPriority="65" w:unhideWhenUsed="0"/>
-    <w:lsdException w:name="Revision" w:unhideWhenUsed="0"/>
-    <w:lsdException w:name="List Paragraph" w:semiHidden="0" w:uiPriority="34" w:unhideWhenUsed="0" w:qFormat="1"/>
-    <w:lsdException w:name="Quote" w:semiHidden="0" w:uiPriority="29" w:unhideWhenUsed="0" w:qFormat="1"/>
-    <w:lsdException w:name="Intense Quote" w:semiHidden="0" w:uiPriority="30" w:unhideWhenUsed="0" w:qFormat="1"/>
-    <w:lsdException w:name="Medium List 2 Accent 1" w:semiHidden="0" w:uiPriority="66" w:unhideWhenUsed="0"/>
-    <w:lsdException w:name="Medium Grid 1 Accent 1" w:semiHidden="0" w:uiPriority="67" w:unhideWhenUsed="0"/>
-    <w:lsdException w:name="Medium Grid 2 Accent 1" w:semiHidden="0" w:uiPriority="68" w:unhideWhenUsed="0"/>
-    <w:lsdException w:name="Medium Grid 3 Accent 1" w:semiHidden="0" w:uiPriority="69" w:unhideWhenUsed="0"/>
-    <w:lsdException w:name="Dark List Accent 1" w:semiHidden="0" w:uiPriority="70" w:unhideWhenUsed="0"/>
-    <w:lsdException w:name="Colorful Shading Accent 1" w:semiHidden="0" w:uiPriority="71" w:unhideWhenUsed="0"/>
-    <w:lsdException w:name="Colorful List Accent 1" w:semiHidden="0" w:uiPriority="72" w:unhideWhenUsed="0"/>
-    <w:lsdException w:name="Colorful Grid Accent 1" w:semiHidden="0" w:uiPriority="73" w:unhideWhenUsed="0"/>
-    <w:lsdException w:name="Light Shading Accent 2" w:semiHidden="0" w:uiPriority="60" w:unhideWhenUsed="0"/>
-    <w:lsdException w:name="Light List Accent 2" w:semiHidden="0" w:uiPriority="61" w:unhideWhenUsed="0"/>
-    <w:lsdException w:name="Light Grid Accent 2" w:semiHidden="0" w:uiPriority="62" w:unhideWhenUsed="0"/>
-    <w:lsdException w:name="Medium Shading 1 Accent 2" w:semiHidden="0" w:uiPriority="63" w:unhideWhenUsed="0"/>
-    <w:lsdException w:name="Medium Shading 2 Accent 2" w:semiHidden="0" w:uiPriority="64" w:unhideWhenUsed="0"/>
-    <w:lsdException w:name="Medium List 1 Accent 2" w:semiHidden="0" w:uiPriority="65" w:unhideWhenUsed="0"/>
-    <w:lsdException w:name="Medium List 2 Accent 2" w:semiHidden="0" w:uiPriority="66" w:unhideWhenUsed="0"/>
-    <w:lsdException w:name="Medium Grid 1 Accent 2" w:semiHidden="0" w:uiPriority="67" w:unhideWhenUsed="0"/>
-    <w:lsdException w:name="Medium Grid 2 Accent 2" w:semiHidden="0" w:uiPriority="68" w:unhideWhenUsed="0"/>
-    <w:lsdException w:name="Medium Grid 3 Accent 2" w:semiHidden="0" w:uiPriority="69" w:unhideWhenUsed="0"/>
-    <w:lsdException w:name="Dark List Accent 2" w:semiHidden="0" w:uiPriority="70" w:unhideWhenUsed="0"/>
-    <w:lsdException w:name="Colorful Shading Accent 2" w:semiHidden="0" w:uiPriority="71" w:unhideWhenUsed="0"/>
-    <w:lsdException w:name="Colorful List Accent 2" w:semiHidden="0" w:uiPriority="72" w:unhideWhenUsed="0"/>
-    <w:lsdException w:name="Colorful Grid Accent 2" w:semiHidden="0" w:uiPriority="73" w:unhideWhenUsed="0"/>
-    <w:lsdException w:name="Light Shading Accent 3" w:semiHidden="0" w:uiPriority="60" w:unhideWhenUsed="0"/>
-    <w:lsdException w:name="Light List Accent 3" w:semiHidden="0" w:uiPriority="61" w:unhideWhenUsed="0"/>
-    <w:lsdException w:name="Light Grid Accent 3" w:semiHidden="0" w:uiPriority="62" w:unhideWhenUsed="0"/>
-    <w:lsdException w:name="Medium Shading 1 Accent 3" w:semiHidden="0" w:uiPriority="63" w:unhideWhenUsed="0"/>
-    <w:lsdException w:name="Medium Shading 2 Accent 3" w:semiHidden="0" w:uiPriority="64" w:unhideWhenUsed="0"/>
-    <w:lsdException w:name="Medium List 1 Accent 3" w:semiHidden="0" w:uiPriority="65" w:unhideWhenUsed="0"/>
-    <w:lsdException w:name="Medium List 2 Accent 3" w:semiHidden="0" w:uiPriority="66" w:unhideWhenUsed="0"/>
-    <w:lsdException w:name="Medium Grid 1 Accent 3" w:semiHidden="0" w:uiPriority="67" w:unhideWhenUsed="0"/>
-    <w:lsdException w:name="Medium Grid 2 Accent 3" w:semiHidden="0" w:uiPriority="68" w:unhideWhenUsed="0"/>
-    <w:lsdException w:name="Medium Grid 3 Accent 3" w:semiHidden="0" w:uiPriority="69" w:unhideWhenUsed="0"/>
-    <w:lsdException w:name="Dark List Accent 3" w:semiHidden="0" w:uiPriority="70" w:unhideWhenUsed="0"/>
-    <w:lsdException w:name="Colorful Shading Accent 3" w:semiHidden="0" w:uiPriority="71" w:unhideWhenUsed="0"/>
-    <w:lsdException w:name="Colorful List Accent 3" w:semiHidden="0" w:uiPriority="72" w:unhideWhenUsed="0"/>
-    <w:lsdException w:name="Colorful Grid Accent 3" w:semiHidden="0" w:uiPriority="73" w:unhideWhenUsed="0"/>
-    <w:lsdException w:name="Light Shading Accent 4" w:semiHidden="0" w:uiPriority="60" w:unhideWhenUsed="0"/>
-    <w:lsdException w:name="Light List Accent 4" w:semiHidden="0" w:uiPriority="61" w:unhideWhenUsed="0"/>
-    <w:lsdException w:name="Light Grid Accent 4" w:semiHidden="0" w:uiPriority="62" w:unhideWhenUsed="0"/>
-    <w:lsdException w:name="Medium Shading 1 Accent 4" w:semiHidden="0" w:uiPriority="63" w:unhideWhenUsed="0"/>
-    <w:lsdException w:name="Medium Shading 2 Accent 4" w:semiHidden="0" w:uiPriority="64" w:unhideWhenUsed="0"/>
-    <w:lsdException w:name="Medium List 1 Accent 4" w:semiHidden="0" w:uiPriority="65" w:unhideWhenUsed="0"/>
-    <w:lsdException w:name="Medium List 2 Accent 4" w:semiHidden="0" w:uiPriority="66" w:unhideWhenUsed="0"/>
-    <w:lsdException w:name="Medium Grid 1 Accent 4" w:semiHidden="0" w:uiPriority="67" w:unhideWhenUsed="0"/>
-    <w:lsdException w:name="Medium Grid 2 Accent 4" w:semiHidden="0" w:uiPriority="68" w:unhideWhenUsed="0"/>
-    <w:lsdException w:name="Medium Grid 3 Accent 4" w:semiHidden="0" w:uiPriority="69" w:unhideWhenUsed="0"/>
-    <w:lsdException w:name="Dark List Accent 4" w:semiHidden="0" w:uiPriority="70" w:unhideWhenUsed="0"/>
-    <w:lsdException w:name="Colorful Shading Accent 4" w:semiHidden="0" w:uiPriority="71" w:unhideWhenUsed="0"/>
-    <w:lsdException w:name="Colorful List Accent 4" w:semiHidden="0" w:uiPriority="72" w:unhideWhenUsed="0"/>
-    <w:lsdException w:name="Colorful Grid Accent 4" w:semiHidden="0" w:uiPriority="73" w:unhideWhenUsed="0"/>
-    <w:lsdException w:name="Light Shading Accent 5" w:semiHidden="0" w:uiPriority="60" w:unhideWhenUsed="0"/>
-    <w:lsdException w:name="Light List Accent 5" w:semiHidden="0" w:uiPriority="61" w:unhideWhenUsed="0"/>
-    <w:lsdException w:name="Light Grid Accent 5" w:semiHidden="0" w:uiPriority="62" w:unhideWhenUsed="0"/>
-    <w:lsdException w:name="Medium Shading 1 Accent 5" w:semiHidden="0" w:uiPriority="63" w:unhideWhenUsed="0"/>
-    <w:lsdException w:name="Medium Shading 2 Accent 5" w:semiHidden="0" w:uiPriority="64" w:unhideWhenUsed="0"/>
-    <w:lsdException w:name="Medium List 1 Accent 5" w:semiHidden="0" w:uiPriority="65" w:unhideWhenUsed="0"/>
-    <w:lsdException w:name="Medium List 2 Accent 5" w:semiHidden="0" w:uiPriority="66" w:unhideWhenUsed="0"/>
-    <w:lsdException w:name="Medium Grid 1 Accent 5" w:semiHidden="0" w:uiPriority="67" w:unhideWhenUsed="0"/>
-    <w:lsdException w:name="Medium Grid 2 Accent 5" w:semiHidden="0" w:uiPriority="68" w:unhideWhenUsed="0"/>
-    <w:lsdException w:name="Medium Grid 3 Accent 5" w:semiHidden="0" w:uiPriority="69" w:unhideWhenUsed="0"/>
-    <w:lsdException w:name="Dark List Accent 5" w:semiHidden="0" w:uiPriority="70" w:unhideWhenUsed="0"/>
-    <w:lsdException w:name="Colorful Shading Accent 5" w:semiHidden="0" w:uiPriority="71" w:unhideWhenUsed="0"/>
-    <w:lsdException w:name="Colorful List Accent 5" w:semiHidden="0" w:uiPriority="72" w:unhideWhenUsed="0"/>
-    <w:lsdException w:name="Colorful Grid Accent 5" w:semiHidden="0" w:uiPriority="73" w:unhideWhenUsed="0"/>
-    <w:lsdException w:name="Light Shading Accent 6" w:semiHidden="0" w:uiPriority="60" w:unhideWhenUsed="0"/>
-    <w:lsdException w:name="Light List Accent 6" w:semiHidden="0" w:uiPriority="61" w:unhideWhenUsed="0"/>
-    <w:lsdException w:name="Light Grid Accent 6" w:semiHidden="0" w:uiPriority="62" w:unhideWhenUsed="0"/>
-    <w:lsdException w:name="Medium Shading 1 Accent 6" w:semiHidden="0" w:uiPriority="63" w:unhideWhenUsed="0"/>
-    <w:lsdException w:name="Medium Shading 2 Accent 6" w:semiHidden="0" w:uiPriority="64" w:unhideWhenUsed="0"/>
-    <w:lsdException w:name="Medium List 1 Accent 6" w:semiHidden="0" w:uiPriority="65" w:unhideWhenUsed="0"/>
-    <w:lsdException w:name="Medium List 2 Accent 6" w:semiHidden="0" w:uiPriority="66" w:unhideWhenUsed="0"/>
-    <w:lsdException w:name="Medium Grid 1 Accent 6" w:semiHidden="0" w:uiPriority="67" w:unhideWhenUsed="0"/>
-    <w:lsdException w:name="Medium Grid 2 Accent 6" w:semiHidden="0" w:uiPriority="68" w:unhideWhenUsed="0"/>
-    <w:lsdException w:name="Medium Grid 3 Accent 6" w:semiHidden="0" w:uiPriority="69" w:unhideWhenUsed="0"/>
-    <w:lsdException w:name="Dark List Accent 6" w:semiHidden="0" w:uiPriority="70" w:unhideWhenUsed="0"/>
-    <w:lsdException w:name="Colorful Shading Accent 6" w:semiHidden="0" w:uiPriority="71" w:unhideWhenUsed="0"/>
-    <w:lsdException w:name="Colorful List Accent 6" w:semiHidden="0" w:uiPriority="72" w:unhideWhenUsed="0"/>
-    <w:lsdException w:name="Colorful Grid Accent 6" w:semiHidden="0" w:uiPriority="73" w:unhideWhenUsed="0"/>
-    <w:lsdException w:name="Subtle Emphasis" w:semiHidden="0" w:uiPriority="19" w:unhideWhenUsed="0" w:qFormat="1"/>
-    <w:lsdException w:name="Intense Emphasis" w:semiHidden="0" w:uiPriority="21" w:unhideWhenUsed="0" w:qFormat="1"/>
-    <w:lsdException w:name="Subtle Reference" w:semiHidden="0" w:uiPriority="31" w:unhideWhenUsed="0" w:qFormat="1"/>
-    <w:lsdException w:name="Intense Reference" w:semiHidden="0" w:uiPriority="32" w:unhideWhenUsed="0" w:qFormat="1"/>
-    <w:lsdException w:name="Book Title" w:semiHidden="0" w:uiPriority="33" w:unhideWhenUsed="0" w:qFormat="1"/>
-    <w:lsdException w:name="Bibliography" w:uiPriority="37"/>
-    <w:lsdException w:name="TOC Heading" w:uiPriority="39" w:qFormat="1"/>
-  </w:latentStyles>
-  <w:style w:type="paragraph" w:default="1" w:styleId="Normal">
-    <w:name w:val="Normal"/>
-    <w:qFormat/>
-  </w:style>
-  <w:style w:type="character" w:default="1" w:styleId="DefaultParagraphFont">
-    <w:name w:val="Default Paragraph Font"/>
-    <w:uiPriority w:val="1"/>
-    <w:semiHidden/>
-    <w:unhideWhenUsed/>
-  </w:style>
-  <w:style w:type="table" w:default="1" w:styleId="TableNormal">
-    <w:name w:val="Normal Table"/>
-    <w:uiPriority w:val="99"/>
-    <w:semiHidden/>
-    <w:unhideWhenUsed/>
-    <w:tblPr>
-      <w:tblInd w:w="0" w:type="dxa"/>
-      <w:tblCellMar>
-        <w:top w:w="0" w:type="dxa"/>
-        <w:left w:w="108" w:type="dxa"/>
-        <w:bottom w:w="0" w:type="dxa"/>
-        <w:right w:w="108" w:type="dxa"/>
-      </w:tblCellMar>
-    </w:tblPr>
-  </w:style>
-  <w:style w:type="numbering" w:default="1" w:styleId="NoList">
-    <w:name w:val="No List"/>
-    <w:uiPriority w:val="99"/>
-    <w:semiHidden/>
-    <w:unhideWhenUsed/>
-  </w:style>
-</w:styles>
-</file>
-
-<file path=word/stylesWithEffects.xml><?xml version="1.0" encoding="utf-8"?>
-<w:styles xmlns:wpc="http://schemas.microsoft.com/office/word/2010/wordprocessingCanvas" xmlns:mc="http://schemas.openxmlformats.org/markup-compatibility/2006" xmlns:o="urn:schemas-microsoft-com:office:office" xmlns:r="http://schemas.openxmlformats.org/officeDocument/2006/relationships" xmlns:m="http://schemas.openxmlformats.org/officeDocument/2006/math" xmlns:v="urn:schemas-microsoft-com:vml" xmlns:wp14="http://schemas.microsoft.com/office/word/2010/wordprocessingDrawing" xmlns:wp="http://schemas.openxmlformats.org/drawingml/2006/wordprocessingDrawing" xmlns:w10="urn:schemas-microsoft-com:office:word" xmlns:w="http://schemas.openxmlformats.org/wordprocessingml/2006/main" xmlns:w14="http://schemas.microsoft.com/office/word/2010/wordml" xmlns:wpg="http://schemas.microsoft.com/office/word/2010/wordprocessingGroup" xmlns:wpi="http://schemas.microsoft.com/office/word/2010/wordprocessingInk" xmlns:wne="http://schemas.microsoft.com/office/word/2006/wordml" xmlns:wps="http://schemas.microsoft.com/office/word/2010/wordprocessingShape" mc:Ignorable="w14 wp14">
-  <w:docDefaults>
-    <w:rPrDefault>
-      <w:rPr>
-        <w:rFonts w:ascii="Times New Roman" w:eastAsiaTheme="minorEastAsia" w:hAnsi="Times New Roman" w:cs="Times New Roman"/>
-        <w:sz w:val="22"/>
-        <w:szCs w:val="22"/>
-        <w:lang w:val="en-US" w:eastAsia="en-US" w:bidi="ar-SA"/>
-      </w:rPr>
-    </w:rPrDefault>
-    <w:pPrDefault/>
-  </w:docDefaults>
-  <w:latentStyles w:defLockedState="0" w:defUIPriority="99" w:defSemiHidden="1" w:defUnhideWhenUsed="1" w:defQFormat="0" w:count="267">
-    <w:lsdException w:name="Normal" w:semiHidden="0" w:uiPriority="0" w:unhideWhenUsed="0" w:qFormat="1"/>
-    <w:lsdException w:name="heading 1" w:semiHidden="0" w:uiPriority="9" w:unhideWhenUsed="0" w:qFormat="1"/>
-    <w:lsdException w:name="heading 2" w:uiPriority="9" w:qFormat="1"/>
-    <w:lsdException w:name="heading 3" w:uiPriority="9" w:qFormat="1"/>
-    <w:lsdException w:name="heading 4" w:uiPriority="9" w:qFormat="1"/>
-    <w:lsdException w:name="heading 5" w:uiPriority="9" w:qFormat="1"/>
-    <w:lsdException w:name="heading 6" w:uiPriority="9" w:qFormat="1"/>
-    <w:lsdException w:name="heading 7" w:uiPriority="9" w:qFormat="1"/>
-    <w:lsdException w:name="heading 8" w:uiPriority="9" w:qFormat="1"/>
-    <w:lsdException w:name="heading 9" w:uiPriority="9" w:qFormat="1"/>
-    <w:lsdException w:name="toc 1" w:uiPriority="39"/>
-    <w:lsdException w:name="toc 2" w:uiPriority="39"/>
-    <w:lsdException w:name="toc 3" w:uiPriority="39"/>
-    <w:lsdException w:name="toc 4" w:uiPriority="39"/>
-    <w:lsdException w:name="toc 5" w:uiPriority="39"/>
-    <w:lsdException w:name="toc 6" w:uiPriority="39"/>
-    <w:lsdException w:name="toc 7" w:uiPriority="39"/>
-    <w:lsdException w:name="toc 8" w:uiPriority="39"/>
-    <w:lsdException w:name="toc 9" w:uiPriority="39"/>
-    <w:lsdException w:name="caption" w:uiPriority="35" w:qFormat="1"/>
-    <w:lsdException w:name="Title" w:semiHidden="0" w:uiPriority="10" w:unhideWhenUsed="0" w:qFormat="1"/>
-    <w:lsdException w:name="Default Paragraph Font" w:uiPriority="1"/>
-    <w:lsdException w:name="Subtitle" w:semiHidden="0" w:uiPriority="11" w:unhideWhenUsed="0" w:qFormat="1"/>
-    <w:lsdException w:name="Strong" w:semiHidden="0" w:uiPriority="22" w:unhideWhenUsed="0" w:qFormat="1"/>
-    <w:lsdException w:name="Emphasis" w:semiHidden="0" w:uiPriority="20" w:unhideWhenUsed="0" w:qFormat="1"/>
-    <w:lsdException w:name="Table Grid" w:semiHidden="0" w:uiPriority="59" w:unhideWhenUsed="0"/>
-    <w:lsdException w:name="Placeholder Text" w:unhideWhenUsed="0"/>
-    <w:lsdException w:name="No Spacing" w:semiHidden="0" w:uiPriority="1" w:unhideWhenUsed="0" w:qFormat="1"/>
-    <w:lsdException w:name="Light Shading" w:semiHidden="0" w:uiPriority="60" w:unhideWhenUsed="0"/>
-    <w:lsdException w:name="Light List" w:semiHidden="0" w:uiPriority="61" w:unhideWhenUsed="0"/>
-    <w:lsdException w:name="Light Grid" w:semiHidden="0" w:uiPriority="62" w:unhideWhenUsed="0"/>
-    <w:lsdException w:name="Medium Shading 1" w:semiHidden="0" w:uiPriority="63" w:unhideWhenUsed="0"/>
-    <w:lsdException w:name="Medium Shading 2" w:semiHidden="0" w:uiPriority="64" w:unhideWhenUsed="0"/>
-    <w:lsdException w:name="Medium List 1" w:semiHidden="0" w:uiPriority="65" w:unhideWhenUsed="0"/>
-    <w:lsdException w:name="Medium List 2" w:semiHidden="0" w:uiPriority="66" w:unhideWhenUsed="0"/>
-    <w:lsdException w:name="Medium Grid 1" w:semiHidden="0" w:uiPriority="67" w:unhideWhenUsed="0"/>
-    <w:lsdException w:name="Medium Grid 2" w:semiHidden="0" w:uiPriority="68" w:unhideWhenUsed="0"/>
-    <w:lsdException w:name="Medium Grid 3" w:semiHidden="0" w:uiPriority="69" w:unhideWhenUsed="0"/>
-    <w:lsdException w:name="Dark List" w:semiHidden="0" w:uiPriority="70" w:unhideWhenUsed="0"/>
-    <w:lsdException w:name="Colorful Shading" w:semiHidden="0" w:uiPriority="71" w:unhideWhenUsed="0"/>
-    <w:lsdException w:name="Colorful List" w:semiHidden="0" w:uiPriority="72" w:unhideWhenUsed="0"/>
-    <w:lsdException w:name="Colorful Grid" w:semiHidden="0" w:uiPriority="73" w:unhideWhenUsed="0"/>
-    <w:lsdException w:name="Light Shading Accent 1" w:semiHidden="0" w:uiPriority="60" w:unhideWhenUsed="0"/>
-    <w:lsdException w:name="Light List Accent 1" w:semiHidden="0" w:uiPriority="61" w:unhideWhenUsed="0"/>
-    <w:lsdException w:name="Light Grid Accent 1" w:semiHidden="0" w:uiPriority="62" w:unhideWhenUsed="0"/>
-    <w:lsdException w:name="Medium Shading 1 Accent 1" w:semiHidden="0" w:uiPriority="63" w:unhideWhenUsed="0"/>
-    <w:lsdException w:name="Medium Shading 2 Accent 1" w:semiHidden="0" w:uiPriority="64" w:unhideWhenUsed="0"/>
-    <w:lsdException w:name="Medium List 1 Accent 1" w:semiHidden="0" w:uiPriority="65" w:unhideWhenUsed="0"/>
-    <w:lsdException w:name="Revision" w:unhideWhenUsed="0"/>
-    <w:lsdException w:name="List Paragraph" w:semiHidden="0" w:uiPriority="34" w:unhideWhenUsed="0" w:qFormat="1"/>
-    <w:lsdException w:name="Quote" w:semiHidden="0" w:uiPriority="29" w:unhideWhenUsed="0" w:qFormat="1"/>
-    <w:lsdException w:name="Intense Quote" w:semiHidden="0" w:uiPriority="30" w:unhideWhenUsed="0" w:qFormat="1"/>
-    <w:lsdException w:name="Medium List 2 Accent 1" w:semiHidden="0" w:uiPriority="66" w:unhideWhenUsed="0"/>
-    <w:lsdException w:name="Medium Grid 1 Accent 1" w:semiHidden="0" w:uiPriority="67" w:unhideWhenUsed="0"/>
-    <w:lsdException w:name="Medium Grid 2 Accent 1" w:semiHidden="0" w:uiPriority="68" w:unhideWhenUsed="0"/>
-    <w:lsdException w:name="Medium Grid 3 Accent 1" w:semiHidden="0" w:uiPriority="69" w:unhideWhenUsed="0"/>
-    <w:lsdException w:name="Dark List Accent 1" w:semiHidden="0" w:uiPriority="70" w:unhideWhenUsed="0"/>
-    <w:lsdException w:name="Colorful Shading Accent 1" w:semiHidden="0" w:uiPriority="71" w:unhideWhenUsed="0"/>
-    <w:lsdException w:name="Colorful List Accent 1" w:semiHidden="0" w:uiPriority="72" w:unhideWhenUsed="0"/>
-    <w:lsdException w:name="Colorful Grid Accent 1" w:semiHidden="0" w:uiPriority="73" w:unhideWhenUsed="0"/>
-    <w:lsdException w:name="Light Shading Accent 2" w:semiHidden="0" w:uiPriority="60" w:unhideWhenUsed="0"/>
-    <w:lsdException w:name="Light List Accent 2" w:semiHidden="0" w:uiPriority="61" w:unhideWhenUsed="0"/>
-    <w:lsdException w:name="Light Grid Accent 2" w:semiHidden="0" w:uiPriority="62" w:unhideWhenUsed="0"/>
-    <w:lsdException w:name="Medium Shading 1 Accent 2" w:semiHidden="0" w:uiPriority="63" w:unhideWhenUsed="0"/>
-    <w:lsdException w:name="Medium Shading 2 Accent 2" w:semiHidden="0" w:uiPriority="64" w:unhideWhenUsed="0"/>
-    <w:lsdException w:name="Medium List 1 Accent 2" w:semiHidden="0" w:uiPriority="65" w:unhideWhenUsed="0"/>
-    <w:lsdException w:name="Medium List 2 Accent 2" w:semiHidden="0" w:uiPriority="66" w:unhideWhenUsed="0"/>
-    <w:lsdException w:name="Medium Grid 1 Accent 2" w:semiHidden="0" w:uiPriority="67" w:unhideWhenUsed="0"/>
-    <w:lsdException w:name="Medium Grid 2 Accent 2" w:semiHidden="0" w:uiPriority="68" w:unhideWhenUsed="0"/>
-    <w:lsdException w:name="Medium Grid 3 Accent 2" w:semiHidden="0" w:uiPriority="69" w:unhideWhenUsed="0"/>
-    <w:lsdException w:name="Dark List Accent 2" w:semiHidden="0" w:uiPriority="70" w:unhideWhenUsed="0"/>
-    <w:lsdException w:name="Colorful Shading Accent 2" w:semiHidden="0" w:uiPriority="71" w:unhideWhenUsed="0"/>
-    <w:lsdException w:name="Colorful List Accent 2" w:semiHidden="0" w:uiPriority="72" w:unhideWhenUsed="0"/>
-    <w:lsdException w:name="Colorful Grid Accent 2" w:semiHidden="0" w:uiPriority="73" w:unhideWhenUsed="0"/>
-    <w:lsdException w:name="Light Shading Accent 3" w:semiHidden="0" w:uiPriority="60" w:unhideWhenUsed="0"/>
-    <w:lsdException w:name="Light List Accent 3" w:semiHidden="0" w:uiPriority="61" w:unhideWhenUsed="0"/>
-    <w:lsdException w:name="Light Grid Accent 3" w:semiHidden="0" w:uiPriority="62" w:unhideWhenUsed="0"/>
-    <w:lsdException w:name="Medium Shading 1 Accent 3" w:semiHidden="0" w:uiPriority="63" w:unhideWhenUsed="0"/>
-    <w:lsdException w:name="Medium Shading 2 Accent 3" w:semiHidden="0" w:uiPriority="64" w:unhideWhenUsed="0"/>
-    <w:lsdException w:name="Medium List 1 Accent 3" w:semiHidden="0" w:uiPriority="65" w:unhideWhenUsed="0"/>
-    <w:lsdException w:name="Medium List 2 Accent 3" w:semiHidden="0" w:uiPriority="66" w:unhideWhenUsed="0"/>
-    <w:lsdException w:name="Medium Grid 1 Accent 3" w:semiHidden="0" w:uiPriority="67" w:unhideWhenUsed="0"/>
-    <w:lsdException w:name="Medium Grid 2 Accent 3" w:semiHidden="0" w:uiPriority="68" w:unhideWhenUsed="0"/>
-    <w:lsdException w:name="Medium Grid 3 Accent 3" w:semiHidden="0" w:uiPriority="69" w:unhideWhenUsed="0"/>
-    <w:lsdException w:name="Dark List Accent 3" w:semiHidden="0" w:uiPriority="70" w:unhideWhenUsed="0"/>
-    <w:lsdException w:name="Colorful Shading Accent 3" w:semiHidden="0" w:uiPriority="71" w:unhideWhenUsed="0"/>
-    <w:lsdException w:name="Colorful List Accent 3" w:semiHidden="0" w:uiPriority="72" w:unhideWhenUsed="0"/>
-    <w:lsdException w:name="Colorful Grid Accent 3" w:semiHidden="0" w:uiPriority="73" w:unhideWhenUsed="0"/>
-    <w:lsdException w:name="Light Shading Accent 4" w:semiHidden="0" w:uiPriority="60" w:unhideWhenUsed="0"/>
-    <w:lsdException w:name="Light List Accent 4" w:semiHidden="0" w:uiPriority="61" w:unhideWhenUsed="0"/>
-    <w:lsdException w:name="Light Grid Accent 4" w:semiHidden="0" w:uiPriority="62" w:unhideWhenUsed="0"/>
-    <w:lsdException w:name="Medium Shading 1 Accent 4" w:semiHidden="0" w:uiPriority="63" w:unhideWhenUsed="0"/>
-    <w:lsdException w:name="Medium Shading 2 Accent 4" w:semiHidden="0" w:uiPriority="64" w:unhideWhenUsed="0"/>
-    <w:lsdException w:name="Medium List 1 Accent 4" w:semiHidden="0" w:uiPriority="65" w:unhideWhenUsed="0"/>
-    <w:lsdException w:name="Medium List 2 Accent 4" w:semiHidden="0" w:uiPriority="66" w:unhideWhenUsed="0"/>
-    <w:lsdException w:name="Medium Grid 1 Accent 4" w:semiHidden="0" w:uiPriority="67" w:unhideWhenUsed="0"/>
-    <w:lsdException w:name="Medium Grid 2 Accent 4" w:semiHidden="0" w:uiPriority="68" w:unhideWhenUsed="0"/>
-    <w:lsdException w:name="Medium Grid 3 Accent 4" w:semiHidden="0" w:uiPriority="69" w:unhideWhenUsed="0"/>
-    <w:lsdException w:name="Dark List Accent 4" w:semiHidden="0" w:uiPriority="70" w:unhideWhenUsed="0"/>
-    <w:lsdException w:name="Colorful Shading Accent 4" w:semiHidden="0" w:uiPriority="71" w:unhideWhenUsed="0"/>
-    <w:lsdException w:name="Colorful List Accent 4" w:semiHidden="0" w:uiPriority="72" w:unhideWhenUsed="0"/>
-    <w:lsdException w:name="Colorful Grid Accent 4" w:semiHidden="0" w:uiPriority="73" w:unhideWhenUsed="0"/>
-    <w:lsdException w:name="Light Shading Accent 5" w:semiHidden="0" w:uiPriority="60" w:unhideWhenUsed="0"/>
-    <w:lsdException w:name="Light List Accent 5" w:semiHidden="0" w:uiPriority="61" w:unhideWhenUsed="0"/>
-    <w:lsdException w:name="Light Grid Accent 5" w:semiHidden="0" w:uiPriority="62" w:unhideWhenUsed="0"/>
-    <w:lsdException w:name="Medium Shading 1 Accent 5" w:semiHidden="0" w:uiPriority="63" w:unhideWhenUsed="0"/>
-    <w:lsdException w:name="Medium Shading 2 Accent 5" w:semiHidden="0" w:uiPriority="64" w:unhideWhenUsed="0"/>
-    <w:lsdException w:name="Medium List 1 Accent 5" w:semiHidden="0" w:uiPriority="65" w:unhideWhenUsed="0"/>
-    <w:lsdException w:name="Medium List 2 Accent 5" w:semiHidden="0" w:uiPriority="66" w:unhideWhenUsed="0"/>
-    <w:lsdException w:name="Medium Grid 1 Accent 5" w:semiHidden="0" w:uiPriority="67" w:unhideWhenUsed="0"/>
-    <w:lsdException w:name="Medium Grid 2 Accent 5" w:semiHidden="0" w:uiPriority="68" w:unhideWhenUsed="0"/>
-    <w:lsdException w:name="Medium Grid 3 Accent 5" w:semiHidden="0" w:uiPriority="69" w:unhideWhenUsed="0"/>
-    <w:lsdException w:name="Dark List Accent 5" w:semiHidden="0" w:uiPriority="70" w:unhideWhenUsed="0"/>
-    <w:lsdException w:name="Colorful Shading Accent 5" w:semiHidden="0" w:uiPriority="71" w:unhideWhenUsed="0"/>
-    <w:lsdException w:name="Colorful List Accent 5" w:semiHidden="0" w:uiPriority="72" w:unhideWhenUsed="0"/>
-    <w:lsdException w:name="Colorful Grid Accent 5" w:semiHidden="0" w:uiPriority="73" w:unhideWhenUsed="0"/>
-    <w:lsdException w:name="Light Shading Accent 6" w:semiHidden="0" w:uiPriority="60" w:unhideWhenUsed="0"/>
-    <w:lsdException w:name="Light List Accent 6" w:semiHidden="0" w:uiPriority="61" w:unhideWhenUsed="0"/>
-    <w:lsdException w:name="Light Grid Accent 6" w:semiHidden="0" w:uiPriority="62" w:unhideWhenUsed="0"/>
-    <w:lsdException w:name="Medium Shading 1 Accent 6" w:semiHidden="0" w:uiPriority="63" w:unhideWhenUsed="0"/>
-    <w:lsdException w:name="Medium Shading 2 Accent 6" w:semiHidden="0" w:uiPriority="64" w:unhideWhenUsed="0"/>
-    <w:lsdException w:name="Medium List 1 Accent 6" w:semiHidden="0" w:uiPriority="65" w:unhideWhenUsed="0"/>
-    <w:lsdException w:name="Medium List 2 Accent 6" w:semiHidden="0" w:uiPriority="66" w:unhideWhenUsed="0"/>
-    <w:lsdException w:name="Medium Grid 1 Accent 6" w:semiHidden="0" w:uiPriority="67" w:unhideWhenUsed="0"/>
-    <w:lsdException w:name="Medium Grid 2 Accent 6" w:semiHidden="0" w:uiPriority="68" w:unhideWhenUsed="0"/>
-    <w:lsdException w:name="Medium Grid 3 Accent 6" w:semiHidden="0" w:uiPriority="69" w:unhideWhenUsed="0"/>
-    <w:lsdException w:name="Dark List Accent 6" w:semiHidden="0" w:uiPriority="70" w:unhideWhenUsed="0"/>
-    <w:lsdException w:name="Colorful Shading Accent 6" w:semiHidden="0" w:uiPriority="71" w:unhideWhenUsed="0"/>
-    <w:lsdException w:name="Colorful List Accent 6" w:semiHidden="0" w:uiPriority="72" w:unhideWhenUsed="0"/>
-    <w:lsdException w:name="Colorful Grid Accent 6" w:semiHidden="0" w:uiPriority="73" w:unhideWhenUsed="0"/>
-    <w:lsdException w:name="Subtle Emphasis" w:semiHidden="0" w:uiPriority="19" w:unhideWhenUsed="0" w:qFormat="1"/>
-    <w:lsdException w:name="Intense Emphasis" w:semiHidden="0" w:uiPriority="21" w:unhideWhenUsed="0" w:qFormat="1"/>
-    <w:lsdException w:name="Subtle Reference" w:semiHidden="0" w:uiPriority="31" w:unhideWhenUsed="0" w:qFormat="1"/>
-    <w:lsdException w:name="Intense Reference" w:semiHidden="0" w:uiPriority="32" w:unhideWhenUsed="0" w:qFormat="1"/>
-    <w:lsdException w:name="Book Title" w:semiHidden="0" w:uiPriority="33" w:unhideWhenUsed="0" w:qFormat="1"/>
-    <w:lsdException w:name="Bibliography" w:uiPriority="37"/>
-    <w:lsdException w:name="TOC Heading" w:uiPriority="39" w:qFormat="1"/>
+  <w:latentStyles w:defLockedState="0" w:defUIPriority="99" w:defSemiHidden="0" w:defUnhideWhenUsed="0" w:defQFormat="0" w:count="376">
+    <w:lsdException w:name="Normal" w:uiPriority="0" w:qFormat="1"/>
+    <w:lsdException w:name="heading 1" w:uiPriority="9" w:qFormat="1"/>
+    <w:lsdException w:name="heading 2" w:semiHidden="1" w:uiPriority="9" w:unhideWhenUsed="1" w:qFormat="1"/>
+    <w:lsdException w:name="heading 3" w:semiHidden="1" w:uiPriority="9" w:unhideWhenUsed="1" w:qFormat="1"/>
+    <w:lsdException w:name="heading 4" w:semiHidden="1" w:uiPriority="9" w:unhideWhenUsed="1" w:qFormat="1"/>
+    <w:lsdException w:name="heading 5" w:semiHidden="1" w:uiPriority="9" w:unhideWhenUsed="1" w:qFormat="1"/>
+    <w:lsdException w:name="heading 6" w:semiHidden="1" w:uiPriority="9" w:unhideWhenUsed="1" w:qFormat="1"/>
+    <w:lsdException w:name="heading 7" w:semiHidden="1" w:uiPriority="9" w:unhideWhenUsed="1" w:qFormat="1"/>
+    <w:lsdException w:name="heading 8" w:semiHidden="1" w:uiPriority="9" w:unhideWhenUsed="1" w:qFormat="1"/>
+    <w:lsdException w:name="heading 9" w:semiHidden="1" w:uiPriority="9" w:unhideWhenUsed="1" w:qFormat="1"/>
+    <w:lsdException w:name="index 1" w:semiHidden="1" w:unhideWhenUsed="1"/>
+    <w:lsdException w:name="index 2" w:semiHidden="1" w:unhideWhenUsed="1"/>
+    <w:lsdException w:name="index 3" w:semiHidden="1" w:unhideWhenUsed="1"/>
+    <w:lsdException w:name="index 4" w:semiHidden="1" w:unhideWhenUsed="1"/>
+    <w:lsdException w:name="index 5" w:semiHidden="1" w:unhideWhenUsed="1"/>
+    <w:lsdException w:name="index 6" w:semiHidden="1" w:unhideWhenUsed="1"/>
+    <w:lsdException w:name="index 7" w:semiHidden="1" w:unhideWhenUsed="1"/>
+    <w:lsdException w:name="index 8" w:semiHidden="1" w:unhideWhenUsed="1"/>
+    <w:lsdException w:name="index 9" w:semiHidden="1" w:unhideWhenUsed="1"/>
+    <w:lsdException w:name="toc 1" w:semiHidden="1" w:uiPriority="39" w:unhideWhenUsed="1"/>
+    <w:lsdException w:name="toc 2" w:semiHidden="1" w:uiPriority="39" w:unhideWhenUsed="1"/>
+    <w:lsdException w:name="toc 3" w:semiHidden="1" w:uiPriority="39" w:unhideWhenUsed="1"/>
+    <w:lsdException w:name="toc 4" w:semiHidden="1" w:uiPriority="39" w:unhideWhenUsed="1"/>
+    <w:lsdException w:name="toc 5" w:semiHidden="1" w:uiPriority="39" w:unhideWhenUsed="1"/>
+    <w:lsdException w:name="toc 6" w:semiHidden="1" w:uiPriority="39" w:unhideWhenUsed="1"/>
+    <w:lsdException w:name="toc 7" w:semiHidden="1" w:uiPriority="39" w:unhideWhenUsed="1"/>
+    <w:lsdException w:name="toc 8" w:semiHidden="1" w:uiPriority="39" w:unhideWhenUsed="1"/>
+    <w:lsdException w:name="toc 9" w:semiHidden="1" w:uiPriority="39" w:unhideWhenUsed="1"/>
+    <w:lsdException w:name="Normal Indent" w:semiHidden="1" w:unhideWhenUsed="1"/>
+    <w:lsdException w:name="footnote text" w:semiHidden="1" w:unhideWhenUsed="1"/>
+    <w:lsdException w:name="annotation text" w:semiHidden="1" w:unhideWhenUsed="1"/>
+    <w:lsdException w:name="header" w:semiHidden="1" w:unhideWhenUsed="1"/>
+    <w:lsdException w:name="footer" w:semiHidden="1" w:unhideWhenUsed="1"/>
+    <w:lsdException w:name="index heading" w:semiHidden="1" w:unhideWhenUsed="1"/>
+    <w:lsdException w:name="caption" w:semiHidden="1" w:uiPriority="35" w:unhideWhenUsed="1" w:qFormat="1"/>
+    <w:lsdException w:name="table of figures" w:semiHidden="1" w:unhideWhenUsed="1"/>
+    <w:lsdException w:name="envelope address" w:semiHidden="1" w:unhideWhenUsed="1"/>
+    <w:lsdException w:name="envelope return" w:semiHidden="1" w:unhideWhenUsed="1"/>
+    <w:lsdException w:name="footnote reference" w:semiHidden="1" w:unhideWhenUsed="1"/>
+    <w:lsdException w:name="annotation reference" w:semiHidden="1" w:unhideWhenUsed="1"/>
+    <w:lsdException w:name="line number" w:semiHidden="1" w:unhideWhenUsed="1"/>
+    <w:lsdException w:name="page number" w:semiHidden="1" w:unhideWhenUsed="1"/>
+    <w:lsdException w:name="endnote reference" w:semiHidden="1" w:unhideWhenUsed="1"/>
+    <w:lsdException w:name="endnote text" w:semiHidden="1" w:unhideWhenUsed="1"/>
+    <w:lsdException w:name="table of authorities" w:semiHidden="1" w:unhideWhenUsed="1"/>
+    <w:lsdException w:name="macro" w:semiHidden="1" w:unhideWhenUsed="1"/>
+    <w:lsdException w:name="toa heading" w:semiHidden="1" w:unhideWhenUsed="1"/>
+    <w:lsdException w:name="List" w:semiHidden="1" w:unhideWhenUsed="1"/>
+    <w:lsdException w:name="List Bullet" w:semiHidden="1" w:unhideWhenUsed="1"/>
+    <w:lsdException w:name="List Number" w:semiHidden="1" w:unhideWhenUsed="1"/>
+    <w:lsdException w:name="List 2" w:semiHidden="1" w:unhideWhenUsed="1"/>
+    <w:lsdException w:name="List 3" w:semiHidden="1" w:unhideWhenUsed="1"/>
+    <w:lsdException w:name="List 4" w:semiHidden="1" w:unhideWhenUsed="1"/>
+    <w:lsdException w:name="List 5" w:semiHidden="1" w:unhideWhenUsed="1"/>
+    <w:lsdException w:name="List Bullet 2" w:semiHidden="1" w:unhideWhenUsed="1"/>
+    <w:lsdException w:name="List Bullet 3" w:semiHidden="1" w:unhideWhenUsed="1"/>
+    <w:lsdException w:name="List Bullet 4" w:semiHidden="1" w:unhideWhenUsed="1"/>
+    <w:lsdException w:name="List Bullet 5" w:semiHidden="1" w:unhideWhenUsed="1"/>
+    <w:lsdException w:name="List Number 2" w:semiHidden="1" w:unhideWhenUsed="1"/>
+    <w:lsdException w:name="List Number 3" w:semiHidden="1" w:unhideWhenUsed="1"/>
+    <w:lsdException w:name="List Number 4" w:semiHidden="1" w:unhideWhenUsed="1"/>
+    <w:lsdException w:name="List Number 5" w:semiHidden="1" w:unhideWhenUsed="1"/>
+    <w:lsdException w:name="Title" w:uiPriority="10" w:qFormat="1"/>
+    <w:lsdException w:name="Closing" w:semiHidden="1" w:unhideWhenUsed="1"/>
+    <w:lsdException w:name="Signature" w:semiHidden="1" w:unhideWhenUsed="1"/>
+    <w:lsdException w:name="Default Paragraph Font" w:semiHidden="1" w:uiPriority="1" w:unhideWhenUsed="1"/>
+    <w:lsdException w:name="Body Text" w:semiHidden="1" w:unhideWhenUsed="1"/>
+    <w:lsdException w:name="Body Text Indent" w:semiHidden="1" w:unhideWhenUsed="1"/>
+    <w:lsdException w:name="List Continue" w:semiHidden="1" w:unhideWhenUsed="1"/>
+    <w:lsdException w:name="List Continue 2" w:semiHidden="1" w:unhideWhenUsed="1"/>
+    <w:lsdException w:name="List Continue 3" w:semiHidden="1" w:unhideWhenUsed="1"/>
+    <w:lsdException w:name="List Continue 4" w:semiHidden="1" w:unhideWhenUsed="1"/>
+    <w:lsdException w:name="List Continue 5" w:semiHidden="1" w:unhideWhenUsed="1"/>
+    <w:lsdException w:name="Message Header" w:semiHidden="1" w:unhideWhenUsed="1"/>
+    <w:lsdException w:name="Subtitle" w:uiPriority="11" w:qFormat="1"/>
+    <w:lsdException w:name="Salutation" w:semiHidden="1" w:unhideWhenUsed="1"/>
+    <w:lsdException w:name="Date" w:semiHidden="1" w:unhideWhenUsed="1"/>
+    <w:lsdException w:name="Body Text First Indent" w:semiHidden="1" w:unhideWhenUsed="1"/>
+    <w:lsdException w:name="Body Text First Indent 2" w:semiHidden="1" w:unhideWhenUsed="1"/>
+    <w:lsdException w:name="Note Heading" w:semiHidden="1" w:unhideWhenUsed="1"/>
+    <w:lsdException w:name="Body Text 2" w:semiHidden="1" w:unhideWhenUsed="1"/>
+    <w:lsdException w:name="Body Text 3" w:semiHidden="1" w:unhideWhenUsed="1"/>
+    <w:lsdException w:name="Body Text Indent 2" w:semiHidden="1" w:unhideWhenUsed="1"/>
+    <w:lsdException w:name="Body Text Indent 3" w:semiHidden="1" w:unhideWhenUsed="1"/>
+    <w:lsdException w:name="Block Text" w:semiHidden="1" w:unhideWhenUsed="1"/>
+    <w:lsdException w:name="Hyperlink" w:semiHidden="1" w:unhideWhenUsed="1"/>
+    <w:lsdException w:name="FollowedHyperlink" w:semiHidden="1" w:unhideWhenUsed="1"/>
+    <w:lsdException w:name="Strong" w:uiPriority="22" w:qFormat="1"/>
+    <w:lsdException w:name="Emphasis" w:uiPriority="20" w:qFormat="1"/>
+    <w:lsdException w:name="Document Map" w:semiHidden="1" w:unhideWhenUsed="1"/>
+    <w:lsdException w:name="Plain Text" w:semiHidden="1" w:unhideWhenUsed="1"/>
+    <w:lsdException w:name="E-mail Signature" w:semiHidden="1" w:unhideWhenUsed="1"/>
+    <w:lsdException w:name="HTML Top of Form" w:semiHidden="1" w:unhideWhenUsed="1"/>
+    <w:lsdException w:name="HTML Bottom of Form" w:semiHidden="1" w:unhideWhenUsed="1"/>
+    <w:lsdException w:name="Normal (Web)" w:semiHidden="1" w:unhideWhenUsed="1"/>
+    <w:lsdException w:name="HTML Acronym" w:semiHidden="1" w:unhideWhenUsed="1"/>
+    <w:lsdException w:name="HTML Address" w:semiHidden="1" w:unhideWhenUsed="1"/>
+    <w:lsdException w:name="HTML Cite" w:semiHidden="1" w:unhideWhenUsed="1"/>
+    <w:lsdException w:name="HTML Code" w:semiHidden="1" w:unhideWhenUsed="1"/>
+    <w:lsdException w:name="HTML Definition" w:semiHidden="1" w:unhideWhenUsed="1"/>
+    <w:lsdException w:name="HTML Keyboard" w:semiHidden="1" w:unhideWhenUsed="1"/>
+    <w:lsdException w:name="HTML Preformatted" w:semiHidden="1" w:unhideWhenUsed="1"/>
+    <w:lsdException w:name="HTML Sample" w:semiHidden="1" w:unhideWhenUsed="1"/>
+    <w:lsdException w:name="HTML Typewriter" w:semiHidden="1" w:unhideWhenUsed="1"/>
+    <w:lsdException w:name="HTML Variable" w:semiHidden="1" w:unhideWhenUsed="1"/>
+    <w:lsdException w:name="Normal Table" w:semiHidden="1" w:unhideWhenUsed="1"/>
+    <w:lsdException w:name="annotation subject" w:semiHidden="1" w:unhideWhenUsed="1"/>
+    <w:lsdException w:name="No List" w:semiHidden="1" w:unhideWhenUsed="1"/>
+    <w:lsdException w:name="Outline List 1" w:semiHidden="1" w:unhideWhenUsed="1"/>
+    <w:lsdException w:name="Outline List 2" w:semiHidden="1" w:unhideWhenUsed="1"/>
+    <w:lsdException w:name="Outline List 3" w:semiHidden="1" w:unhideWhenUsed="1"/>
+    <w:lsdException w:name="Table Simple 1" w:semiHidden="1" w:unhideWhenUsed="1"/>
+    <w:lsdException w:name="Table Simple 2" w:semiHidden="1" w:unhideWhenUsed="1"/>
+    <w:lsdException w:name="Table Simple 3" w:semiHidden="1" w:unhideWhenUsed="1"/>
+    <w:lsdException w:name="Table Classic 1" w:semiHidden="1" w:unhideWhenUsed="1"/>
+    <w:lsdException w:name="Table Classic 2" w:semiHidden="1" w:unhideWhenUsed="1"/>
+    <w:lsdException w:name="Table Classic 3" w:semiHidden="1" w:unhideWhenUsed="1"/>
+    <w:lsdException w:name="Table Classic 4" w:semiHidden="1" w:unhideWhenUsed="1"/>
+    <w:lsdException w:name="Table Colorful 1" w:semiHidden="1" w:unhideWhenUsed="1"/>
+    <w:lsdException w:name="Table Colorful 2" w:semiHidden="1" w:unhideWhenUsed="1"/>
+    <w:lsdException w:name="Table Colorful 3" w:semiHidden="1" w:unhideWhenUsed="1"/>
+    <w:lsdException w:name="Table Columns 1" w:semiHidden="1" w:unhideWhenUsed="1"/>
+    <w:lsdException w:name="Table Columns 2" w:semiHidden="1" w:unhideWhenUsed="1"/>
+    <w:lsdException w:name="Table Columns 3" w:semiHidden="1" w:unhideWhenUsed="1"/>
+    <w:lsdException w:name="Table Columns 4" w:semiHidden="1" w:unhideWhenUsed="1"/>
+    <w:lsdException w:name="Table Columns 5" w:semiHidden="1" w:unhideWhenUsed="1"/>
+    <w:lsdException w:name="Table Grid 1" w:semiHidden="1" w:unhideWhenUsed="1"/>
+    <w:lsdException w:name="Table Grid 2" w:semiHidden="1" w:unhideWhenUsed="1"/>
+    <w:lsdException w:name="Table Grid 3" w:semiHidden="1" w:unhideWhenUsed="1"/>
+    <w:lsdException w:name="Table Grid 4" w:semiHidden="1" w:unhideWhenUsed="1"/>
+    <w:lsdException w:name="Table Grid 5" w:semiHidden="1" w:unhideWhenUsed="1"/>
+    <w:lsdException w:name="Table Grid 6" w:semiHidden="1" w:unhideWhenUsed="1"/>
+    <w:lsdException w:name="Table Grid 7" w:semiHidden="1" w:unhideWhenUsed="1"/>
+    <w:lsdException w:name="Table Grid 8" w:semiHidden="1" w:unhideWhenUsed="1"/>
+    <w:lsdException w:name="Table List 1" w:semiHidden="1" w:unhideWhenUsed="1"/>
+    <w:lsdException w:name="Table List 2" w:semiHidden="1" w:unhideWhenUsed="1"/>
+    <w:lsdException w:name="Table List 3" w:semiHidden="1" w:unhideWhenUsed="1"/>
+    <w:lsdException w:name="Table List 4" w:semiHidden="1" w:unhideWhenUsed="1"/>
+    <w:lsdException w:name="Table List 5" w:semiHidden="1" w:unhideWhenUsed="1"/>
+    <w:lsdException w:name="Table List 6" w:semiHidden="1" w:unhideWhenUsed="1"/>
+    <w:lsdException w:name="Table List 7" w:semiHidden="1" w:unhideWhenUsed="1"/>
+    <w:lsdException w:name="Table List 8" w:semiHidden="1" w:unhideWhenUsed="1"/>
+    <w:lsdException w:name="Table 3D effects 1" w:semiHidden="1" w:unhideWhenUsed="1"/>
+    <w:lsdException w:name="Table 3D effects 2" w:semiHidden="1" w:unhideWhenUsed="1"/>
+    <w:lsdException w:name="Table 3D effects 3" w:semiHidden="1" w:unhideWhenUsed="1"/>
+    <w:lsdException w:name="Table Contemporary" w:semiHidden="1" w:unhideWhenUsed="1"/>
+    <w:lsdException w:name="Table Elegant" w:semiHidden="1" w:unhideWhenUsed="1"/>
+    <w:lsdException w:name="Table Professional" w:semiHidden="1" w:unhideWhenUsed="1"/>
+    <w:lsdException w:name="Table Subtle 1" w:semiHidden="1" w:unhideWhenUsed="1"/>
+    <w:lsdException w:name="Table Subtle 2" w:semiHidden="1" w:unhideWhenUsed="1"/>
+    <w:lsdException w:name="Table Web 1" w:semiHidden="1" w:unhideWhenUsed="1"/>
+    <w:lsdException w:name="Table Web 2" w:semiHidden="1" w:unhideWhenUsed="1"/>
+    <w:lsdException w:name="Table Web 3" w:semiHidden="1" w:unhideWhenUsed="1"/>
+    <w:lsdException w:name="Balloon Text" w:semiHidden="1" w:unhideWhenUsed="1"/>
+    <w:lsdException w:name="Table Grid" w:uiPriority="59"/>
+    <w:lsdException w:name="Table Theme" w:semiHidden="1" w:unhideWhenUsed="1"/>
+    <w:lsdException w:name="Placeholder Text" w:semiHidden="1"/>
+    <w:lsdException w:name="No Spacing" w:uiPriority="1" w:qFormat="1"/>
+    <w:lsdException w:name="Light Shading" w:uiPriority="60"/>
+    <w:lsdException w:name="Light List" w:uiPriority="61"/>
+    <w:lsdException w:name="Light Grid" w:uiPriority="62"/>
+    <w:lsdException w:name="Medium Shading 1" w:uiPriority="63"/>
+    <w:lsdException w:name="Medium Shading 2" w:uiPriority="64"/>
+    <w:lsdException w:name="Medium List 1" w:uiPriority="65"/>
+    <w:lsdException w:name="Medium List 2" w:uiPriority="66"/>
+    <w:lsdException w:name="Medium Grid 1" w:uiPriority="67"/>
+    <w:lsdException w:name="Medium Grid 2" w:uiPriority="68"/>
+    <w:lsdException w:name="Medium Grid 3" w:uiPriority="69"/>
+    <w:lsdException w:name="Dark List" w:uiPriority="70"/>
+    <w:lsdException w:name="Colorful Shading" w:uiPriority="71"/>
+    <w:lsdException w:name="Colorful List" w:uiPriority="72"/>
+    <w:lsdException w:name="Colorful Grid" w:uiPriority="73"/>
+    <w:lsdException w:name="Light Shading Accent 1" w:uiPriority="60"/>
+    <w:lsdException w:name="Light List Accent 1" w:uiPriority="61"/>
+    <w:lsdException w:name="Light Grid Accent 1" w:uiPriority="62"/>
+    <w:lsdException w:name="Medium Shading 1 Accent 1" w:uiPriority="63"/>
+    <w:lsdException w:name="Medium Shading 2 Accent 1" w:uiPriority="64"/>
+    <w:lsdException w:name="Medium List 1 Accent 1" w:uiPriority="65"/>
+    <w:lsdException w:name="Revision" w:semiHidden="1"/>
+    <w:lsdException w:name="List Paragraph" w:uiPriority="34" w:qFormat="1"/>
+    <w:lsdException w:name="Quote" w:uiPriority="29" w:qFormat="1"/>
+    <w:lsdException w:name="Intense Quote" w:uiPriority="30" w:qFormat="1"/>
+    <w:lsdException w:name="Medium List 2 Accent 1" w:uiPriority="66"/>
+    <w:lsdException w:name="Medium Grid 1 Accent 1" w:uiPriority="67"/>
+    <w:lsdException w:name="Medium Grid 2 Accent 1" w:uiPriority="68"/>
+    <w:lsdException w:name="Medium Grid 3 Accent 1" w:uiPriority="69"/>
+    <w:lsdException w:name="Dark List Accent 1" w:uiPriority="70"/>
+    <w:lsdException w:name="Colorful Shading Accent 1" w:uiPriority="71"/>
+    <w:lsdException w:name="Colorful List Accent 1" w:uiPriority="72"/>
+    <w:lsdException w:name="Colorful Grid Accent 1" w:uiPriority="73"/>
+    <w:lsdException w:name="Light Shading Accent 2" w:uiPriority="60"/>
+    <w:lsdException w:name="Light List Accent 2" w:uiPriority="61"/>
+    <w:lsdException w:name="Light Grid Accent 2" w:uiPriority="62"/>
+    <w:lsdException w:name="Medium Shading 1 Accent 2" w:uiPriority="63"/>
+    <w:lsdException w:name="Medium Shading 2 Accent 2" w:uiPriority="64"/>
+    <w:lsdException w:name="Medium List 1 Accent 2" w:uiPriority="65"/>
+    <w:lsdException w:name="Medium List 2 Accent 2" w:uiPriority="66"/>
+    <w:lsdException w:name="Medium Grid 1 Accent 2" w:uiPriority="67"/>
+    <w:lsdException w:name="Medium Grid 2 Accent 2" w:uiPriority="68"/>
+    <w:lsdException w:name="Medium Grid 3 Accent 2" w:uiPriority="69"/>
+    <w:lsdException w:name="Dark List Accent 2" w:uiPriority="70"/>
+    <w:lsdException w:name="Colorful Shading Accent 2" w:uiPriority="71"/>
+    <w:lsdException w:name="Colorful List Accent 2" w:uiPriority="72"/>
+    <w:lsdException w:name="Colorful Grid Accent 2" w:uiPriority="73"/>
+    <w:lsdException w:name="Light Shading Accent 3" w:uiPriority="60"/>
+    <w:lsdException w:name="Light List Accent 3" w:uiPriority="61"/>
+    <w:lsdException w:name="Light Grid Accent 3" w:uiPriority="62"/>
+    <w:lsdException w:name="Medium Shading 1 Accent 3" w:uiPriority="63"/>
+    <w:lsdException w:name="Medium Shading 2 Accent 3" w:uiPriority="64"/>
+    <w:lsdException w:name="Medium List 1 Accent 3" w:uiPriority="65"/>
+    <w:lsdException w:name="Medium List 2 Accent 3" w:uiPriority="66"/>
+    <w:lsdException w:name="Medium Grid 1 Accent 3" w:uiPriority="67"/>
+    <w:lsdException w:name="Medium Grid 2 Accent 3" w:uiPriority="68"/>
+    <w:lsdException w:name="Medium Grid 3 Accent 3" w:uiPriority="69"/>
+    <w:lsdException w:name="Dark List Accent 3" w:uiPriority="70"/>
+    <w:lsdException w:name="Colorful Shading Accent 3" w:uiPriority="71"/>
+    <w:lsdException w:name="Colorful List Accent 3" w:uiPriority="72"/>
+    <w:lsdException w:name="Colorful Grid Accent 3" w:uiPriority="73"/>
+    <w:lsdException w:name="Light Shading Accent 4" w:uiPriority="60"/>
+    <w:lsdException w:name="Light List Accent 4" w:uiPriority="61"/>
+    <w:lsdException w:name="Light Grid Accent 4" w:uiPriority="62"/>
+    <w:lsdException w:name="Medium Shading 1 Accent 4" w:uiPriority="63"/>
+    <w:lsdException w:name="Medium Shading 2 Accent 4" w:uiPriority="64"/>
+    <w:lsdException w:name="Medium List 1 Accent 4" w:uiPriority="65"/>
+    <w:lsdException w:name="Medium List 2 Accent 4" w:uiPriority="66"/>
+    <w:lsdException w:name="Medium Grid 1 Accent 4" w:uiPriority="67"/>
+    <w:lsdException w:name="Medium Grid 2 Accent 4" w:uiPriority="68"/>
+    <w:lsdException w:name="Medium Grid 3 Accent 4" w:uiPriority="69"/>
+    <w:lsdException w:name="Dark List Accent 4" w:uiPriority="70"/>
+    <w:lsdException w:name="Colorful Shading Accent 4" w:uiPriority="71"/>
+    <w:lsdException w:name="Colorful List Accent 4" w:uiPriority="72"/>
+    <w:lsdException w:name="Colorful Grid Accent 4" w:uiPriority="73"/>
+    <w:lsdException w:name="Light Shading Accent 5" w:uiPriority="60"/>
+    <w:lsdException w:name="Light List Accent 5" w:uiPriority="61"/>
+    <w:lsdException w:name="Light Grid Accent 5" w:uiPriority="62"/>
+    <w:lsdException w:name="Medium Shading 1 Accent 5" w:uiPriority="63"/>
+    <w:lsdException w:name="Medium Shading 2 Accent 5" w:uiPriority="64"/>
+    <w:lsdException w:name="Medium List 1 Accent 5" w:uiPriority="65"/>
+    <w:lsdException w:name="Medium List 2 Accent 5" w:uiPriority="66"/>
+    <w:lsdException w:name="Medium Grid 1 Accent 5" w:uiPriority="67"/>
+    <w:lsdException w:name="Medium Grid 2 Accent 5" w:uiPriority="68"/>
+    <w:lsdException w:name="Medium Grid 3 Accent 5" w:uiPriority="69"/>
+    <w:lsdException w:name="Dark List Accent 5" w:uiPriority="70"/>
+    <w:lsdException w:name="Colorful Shading Accent 5" w:uiPriority="71"/>
+    <w:lsdException w:name="Colorful List Accent 5" w:uiPriority="72"/>
+    <w:lsdException w:name="Colorful Grid Accent 5" w:uiPriority="73"/>
+    <w:lsdException w:name="Light Shading Accent 6" w:uiPriority="60"/>
+    <w:lsdException w:name="Light List Accent 6" w:uiPriority="61"/>
+    <w:lsdException w:name="Light Grid Accent 6" w:uiPriority="62"/>
+    <w:lsdException w:name="Medium Shading 1 Accent 6" w:uiPriority="63"/>
+    <w:lsdException w:name="Medium Shading 2 Accent 6" w:uiPriority="64"/>
+    <w:lsdException w:name="Medium List 1 Accent 6" w:uiPriority="65"/>
+    <w:lsdException w:name="Medium List 2 Accent 6" w:uiPriority="66"/>
+    <w:lsdException w:name="Medium Grid 1 Accent 6" w:uiPriority="67"/>
+    <w:lsdException w:name="Medium Grid 2 Accent 6" w:uiPriority="68"/>
+    <w:lsdException w:name="Medium Grid 3 Accent 6" w:uiPriority="69"/>
+    <w:lsdException w:name="Dark List Accent 6" w:uiPriority="70"/>
+    <w:lsdException w:name="Colorful Shading Accent 6" w:uiPriority="71"/>
+    <w:lsdException w:name="Colorful List Accent 6" w:uiPriority="72"/>
+    <w:lsdException w:name="Colorful Grid Accent 6" w:uiPriority="73"/>
+    <w:lsdException w:name="Subtle Emphasis" w:uiPriority="19" w:qFormat="1"/>
+    <w:lsdException w:name="Intense Emphasis" w:uiPriority="21" w:qFormat="1"/>
+    <w:lsdException w:name="Subtle Reference" w:uiPriority="31" w:qFormat="1"/>
+    <w:lsdException w:name="Intense Reference" w:uiPriority="32" w:qFormat="1"/>
+    <w:lsdException w:name="Book Title" w:uiPriority="33" w:qFormat="1"/>
+    <w:lsdException w:name="Bibliography" w:semiHidden="1" w:uiPriority="37" w:unhideWhenUsed="1"/>
+    <w:lsdException w:name="TOC Heading" w:semiHidden="1" w:uiPriority="39" w:unhideWhenUsed="1" w:qFormat="1"/>
+    <w:lsdException w:name="Plain Table 1" w:uiPriority="41"/>
+    <w:lsdException w:name="Plain Table 2" w:uiPriority="42"/>
+    <w:lsdException w:name="Plain Table 3" w:uiPriority="43"/>
+    <w:lsdException w:name="Plain Table 4" w:uiPriority="44"/>
+    <w:lsdException w:name="Plain Table 5" w:uiPriority="45"/>
+    <w:lsdException w:name="Grid Table Light" w:uiPriority="40"/>
+    <w:lsdException w:name="Grid Table 1 Light" w:uiPriority="46"/>
+    <w:lsdException w:name="Grid Table 2" w:uiPriority="47"/>
+    <w:lsdException w:name="Grid Table 3" w:uiPriority="48"/>
+    <w:lsdException w:name="Grid Table 4" w:uiPriority="49"/>
+    <w:lsdException w:name="Grid Table 5 Dark" w:uiPriority="50"/>
+    <w:lsdException w:name="Grid Table 6 Colorful" w:uiPriority="51"/>
+    <w:lsdException w:name="Grid Table 7 Colorful" w:uiPriority="52"/>
+    <w:lsdException w:name="Grid Table 1 Light Accent 1" w:uiPriority="46"/>
+    <w:lsdException w:name="Grid Table 2 Accent 1" w:uiPriority="47"/>
+    <w:lsdException w:name="Grid Table 3 Accent 1" w:uiPriority="48"/>
+    <w:lsdException w:name="Grid Table 4 Accent 1" w:uiPriority="49"/>
+    <w:lsdException w:name="Grid Table 5 Dark Accent 1" w:uiPriority="50"/>
+    <w:lsdException w:name="Grid Table 6 Colorful Accent 1" w:uiPriority="51"/>
+    <w:lsdException w:name="Grid Table 7 Colorful Accent 1" w:uiPriority="52"/>
+    <w:lsdException w:name="Grid Table 1 Light Accent 2" w:uiPriority="46"/>
+    <w:lsdException w:name="Grid Table 2 Accent 2" w:uiPriority="47"/>
+    <w:lsdException w:name="Grid Table 3 Accent 2" w:uiPriority="48"/>
+    <w:lsdException w:name="Grid Table 4 Accent 2" w:uiPriority="49"/>
+    <w:lsdException w:name="Grid Table 5 Dark Accent 2" w:uiPriority="50"/>
+    <w:lsdException w:name="Grid Table 6 Colorful Accent 2" w:uiPriority="51"/>
+    <w:lsdException w:name="Grid Table 7 Colorful Accent 2" w:uiPriority="52"/>
+    <w:lsdException w:name="Grid Table 1 Light Accent 3" w:uiPriority="46"/>
+    <w:lsdException w:name="Grid Table 2 Accent 3" w:uiPriority="47"/>
+    <w:lsdException w:name="Grid Table 3 Accent 3" w:uiPriority="48"/>
+    <w:lsdException w:name="Grid Table 4 Accent 3" w:uiPriority="49"/>
+    <w:lsdException w:name="Grid Table 5 Dark Accent 3" w:uiPriority="50"/>
+    <w:lsdException w:name="Grid Table 6 Colorful Accent 3" w:uiPriority="51"/>
+    <w:lsdException w:name="Grid Table 7 Colorful Accent 3" w:uiPriority="52"/>
+    <w:lsdException w:name="Grid Table 1 Light Accent 4" w:uiPriority="46"/>
+    <w:lsdException w:name="Grid Table 2 Accent 4" w:uiPriority="47"/>
+    <w:lsdException w:name="Grid Table 3 Accent 4" w:uiPriority="48"/>
+    <w:lsdException w:name="Grid Table 4 Accent 4" w:uiPriority="49"/>
+    <w:lsdException w:name="Grid Table 5 Dark Accent 4" w:uiPriority="50"/>
+    <w:lsdException w:name="Grid Table 6 Colorful Accent 4" w:uiPriority="51"/>
+    <w:lsdException w:name="Grid Table 7 Colorful Accent 4" w:uiPriority="52"/>
+    <w:lsdException w:name="Grid Table 1 Light Accent 5" w:uiPriority="46"/>
+    <w:lsdException w:name="Grid Table 2 Accent 5" w:uiPriority="47"/>
+    <w:lsdException w:name="Grid Table 3 Accent 5" w:uiPriority="48"/>
+    <w:lsdException w:name="Grid Table 4 Accent 5" w:uiPriority="49"/>
+    <w:lsdException w:name="Grid Table 5 Dark Accent 5" w:uiPriority="50"/>
+    <w:lsdException w:name="Grid Table 6 Colorful Accent 5" w:uiPriority="51"/>
+    <w:lsdException w:name="Grid Table 7 Colorful Accent 5" w:uiPriority="52"/>
+    <w:lsdException w:name="Grid Table 1 Light Accent 6" w:uiPriority="46"/>
+    <w:lsdException w:name="Grid Table 2 Accent 6" w:uiPriority="47"/>
+    <w:lsdException w:name="Grid Table 3 Accent 6" w:uiPriority="48"/>
+    <w:lsdException w:name="Grid Table 4 Accent 6" w:uiPriority="49"/>
+    <w:lsdException w:name="Grid Table 5 Dark Accent 6" w:uiPriority="50"/>
+    <w:lsdException w:name="Grid Table 6 Colorful Accent 6" w:uiPriority="51"/>
+    <w:lsdException w:name="Grid Table 7 Colorful Accent 6" w:uiPriority="52"/>
+    <w:lsdException w:name="List Table 1 Light" w:uiPriority="46"/>
+    <w:lsdException w:name="List Table 2" w:uiPriority="47"/>
+    <w:lsdException w:name="List Table 3" w:uiPriority="48"/>
+    <w:lsdException w:name="List Table 4" w:uiPriority="49"/>
+    <w:lsdException w:name="List Table 5 Dark" w:uiPriority="50"/>
+    <w:lsdException w:name="List Table 6 Colorful" w:uiPriority="51"/>
+    <w:lsdException w:name="List Table 7 Colorful" w:uiPriority="52"/>
+    <w:lsdException w:name="List Table 1 Light Accent 1" w:uiPriority="46"/>
+    <w:lsdException w:name="List Table 2 Accent 1" w:uiPriority="47"/>
+    <w:lsdException w:name="List Table 3 Accent 1" w:uiPriority="48"/>
+    <w:lsdException w:name="List Table 4 Accent 1" w:uiPriority="49"/>
+    <w:lsdException w:name="List Table 5 Dark Accent 1" w:uiPriority="50"/>
+    <w:lsdException w:name="List Table 6 Colorful Accent 1" w:uiPriority="51"/>
+    <w:lsdException w:name="List Table 7 Colorful Accent 1" w:uiPriority="52"/>
+    <w:lsdException w:name="List Table 1 Light Accent 2" w:uiPriority="46"/>
+    <w:lsdException w:name="List Table 2 Accent 2" w:uiPriority="47"/>
+    <w:lsdException w:name="List Table 3 Accent 2" w:uiPriority="48"/>
+    <w:lsdException w:name="List Table 4 Accent 2" w:uiPriority="49"/>
+    <w:lsdException w:name="List Table 5 Dark Accent 2" w:uiPriority="50"/>
+    <w:lsdException w:name="List Table 6 Colorful Accent 2" w:uiPriority="51"/>
+    <w:lsdException w:name="List Table 7 Colorful Accent 2" w:uiPriority="52"/>
+    <w:lsdException w:name="List Table 1 Light Accent 3" w:uiPriority="46"/>
+    <w:lsdException w:name="List Table 2 Accent 3" w:uiPriority="47"/>
+    <w:lsdException w:name="List Table 3 Accent 3" w:uiPriority="48"/>
+    <w:lsdException w:name="List Table 4 Accent 3" w:uiPriority="49"/>
+    <w:lsdException w:name="List Table 5 Dark Accent 3" w:uiPriority="50"/>
+    <w:lsdException w:name="List Table 6 Colorful Accent 3" w:uiPriority="51"/>
+    <w:lsdException w:name="List Table 7 Colorful Accent 3" w:uiPriority="52"/>
+    <w:lsdException w:name="List Table 1 Light Accent 4" w:uiPriority="46"/>
+    <w:lsdException w:name="List Table 2 Accent 4" w:uiPriority="47"/>
+    <w:lsdException w:name="List Table 3 Accent 4" w:uiPriority="48"/>
+    <w:lsdException w:name="List Table 4 Accent 4" w:uiPriority="49"/>
+    <w:lsdException w:name="List Table 5 Dark Accent 4" w:uiPriority="50"/>
+    <w:lsdException w:name="List Table 6 Colorful Accent 4" w:uiPriority="51"/>
+    <w:lsdException w:name="List Table 7 Colorful Accent 4" w:uiPriority="52"/>
+    <w:lsdException w:name="List Table 1 Light Accent 5" w:uiPriority="46"/>
+    <w:lsdException w:name="List Table 2 Accent 5" w:uiPriority="47"/>
+    <w:lsdException w:name="List Table 3 Accent 5" w:uiPriority="48"/>
+    <w:lsdException w:name="List Table 4 Accent 5" w:uiPriority="49"/>
+    <w:lsdException w:name="List Table 5 Dark Accent 5" w:uiPriority="50"/>
+    <w:lsdException w:name="List Table 6 Colorful Accent 5" w:uiPriority="51"/>
+    <w:lsdException w:name="List Table 7 Colorful Accent 5" w:uiPriority="52"/>
+    <w:lsdException w:name="List Table 1 Light Accent 6" w:uiPriority="46"/>
+    <w:lsdException w:name="List Table 2 Accent 6" w:uiPriority="47"/>
+    <w:lsdException w:name="List Table 3 Accent 6" w:uiPriority="48"/>
+    <w:lsdException w:name="List Table 4 Accent 6" w:uiPriority="49"/>
+    <w:lsdException w:name="List Table 5 Dark Accent 6" w:uiPriority="50"/>
+    <w:lsdException w:name="List Table 6 Colorful Accent 6" w:uiPriority="51"/>
+    <w:lsdException w:name="List Table 7 Colorful Accent 6" w:uiPriority="52"/>
+    <w:lsdException w:name="Mention" w:semiHidden="1" w:unhideWhenUsed="1"/>
+    <w:lsdException w:name="Smart Hyperlink" w:semiHidden="1" w:unhideWhenUsed="1"/>
+    <w:lsdException w:name="Hashtag" w:semiHidden="1" w:unhideWhenUsed="1"/>
+    <w:lsdException w:name="Unresolved Mention" w:semiHidden="1" w:unhideWhenUsed="1"/>
+    <w:lsdException w:name="Smart Link" w:semiHidden="1" w:unhideWhenUsed="1"/>
   </w:latentStyles>
   <w:style w:type="paragraph" w:default="1" w:styleId="Normal">
     <w:name w:val="Normal"/>

</xml_diff>